<commit_message>
Somar o total da ordem e mostrar o R$ nos itens
Na seção de equipamento, a observação abre a seção e o rótulo
"Serviço executado / observações" virou "Observação".

O total da ordem deixa de ser digitado: passa a ser a soma das linhas
(quantidade × valor unitário − desconto, ou o total digitado na linha).
Todo valor sai formatado em reais, então "150" vira "R$ 150,00" no DOCX
e no PDF.

Co-Authored-By: Claude Opus 5 <noreply@anthropic.com>
</commit_message>
<xml_diff>
--- a/scripts/saida-teste/ordem Maria da Silva & Filhos Ltda 25-07-2026.docx
+++ b/scripts/saida-teste/ordem Maria da Silva & Filhos Ltda 25-07-2026.docx
@@ -1309,6 +1309,47 @@
                 <w:sz w:val="15"/>
                 <w:szCs w:val="15"/>
               </w:rPr>
+              <w:t xml:space="preserve">Observação:</w:t>
+            </w:r>
+            <w:r>
+              <w:rPr>
+                <w:rFonts w:ascii="Arial" w:hAnsi="Arial"/>
+                <w:b w:val="0"/>
+                <w:sz w:val="14"/>
+                <w:szCs w:val="14"/>
+              </w:rPr>
+              <w:t xml:space="preserve"> Instalação com teste de vazão.</w:t>
+            </w:r>
+          </w:p>
+        </w:tc>
+        <w:tc>
+          <w:tcPr>
+            <w:tcW w:type="dxa" w:w="5300"/>
+            <w:tcBorders>
+              <w:top w:val="single" w:sz="6" w:color="000000"/>
+              <w:left w:val="single" w:sz="6" w:color="000000"/>
+              <w:bottom w:val="single" w:sz="6" w:color="000000"/>
+              <w:right w:val="single" w:sz="6" w:color="000000"/>
+            </w:tcBorders>
+            <w:tcMar>
+              <w:top w:w="45" w:type="dxa"/>
+              <w:start w:w="90" w:type="dxa"/>
+              <w:bottom w:w="45" w:type="dxa"/>
+              <w:end w:w="90" w:type="dxa"/>
+            </w:tcMar>
+            <w:vAlign w:val="top"/>
+          </w:tcPr>
+          <w:p>
+            <w:pPr>
+              <w:spacing w:before="0" w:after="0" w:line="240" w:lineRule="auto"/>
+            </w:pPr>
+            <w:r>
+              <w:rPr>
+                <w:rFonts w:ascii="Arial" w:hAnsi="Arial"/>
+                <w:b/>
+                <w:sz w:val="15"/>
+                <w:szCs w:val="15"/>
+              </w:rPr>
               <w:t xml:space="preserve">Equipamento / modelo:</w:t>
             </w:r>
             <w:r>
@@ -1340,38 +1381,6 @@
                 <w:szCs w:val="15"/>
               </w:rPr>
               <w:t xml:space="preserve"> WF-2026-001</w:t>
-            </w:r>
-          </w:p>
-        </w:tc>
-        <w:tc>
-          <w:tcPr>
-            <w:tcW w:type="dxa" w:w="5300"/>
-            <w:tcBorders>
-              <w:top w:val="single" w:sz="6" w:color="000000"/>
-              <w:left w:val="single" w:sz="6" w:color="000000"/>
-              <w:bottom w:val="single" w:sz="6" w:color="000000"/>
-              <w:right w:val="single" w:sz="6" w:color="000000"/>
-            </w:tcBorders>
-            <w:tcMar>
-              <w:top w:w="45" w:type="dxa"/>
-              <w:start w:w="90" w:type="dxa"/>
-              <w:bottom w:w="45" w:type="dxa"/>
-              <w:end w:w="90" w:type="dxa"/>
-            </w:tcMar>
-            <w:vAlign w:val="top"/>
-          </w:tcPr>
-          <w:p>
-            <w:pPr>
-              <w:spacing w:before="0" w:after="0" w:line="240" w:lineRule="auto"/>
-            </w:pPr>
-            <w:r>
-              <w:rPr>
-                <w:rFonts w:ascii="Arial" w:hAnsi="Arial"/>
-                <w:b/>
-                <w:sz w:val="15"/>
-                <w:szCs w:val="15"/>
-              </w:rPr>
-              <w:t xml:space="preserve">Defeito relatado pelo cliente:</w:t>
             </w:r>
           </w:p>
         </w:tc>
@@ -1408,48 +1417,39 @@
                 <w:sz w:val="15"/>
                 <w:szCs w:val="15"/>
               </w:rPr>
+              <w:t xml:space="preserve">Defeito relatado pelo cliente:</w:t>
+            </w:r>
+          </w:p>
+        </w:tc>
+        <w:tc>
+          <w:tcPr>
+            <w:tcW w:type="dxa" w:w="5300"/>
+            <w:tcBorders>
+              <w:top w:val="single" w:sz="6" w:color="000000"/>
+              <w:left w:val="single" w:sz="6" w:color="000000"/>
+              <w:bottom w:val="single" w:sz="6" w:color="000000"/>
+              <w:right w:val="single" w:sz="6" w:color="000000"/>
+            </w:tcBorders>
+            <w:tcMar>
+              <w:top w:w="45" w:type="dxa"/>
+              <w:start w:w="90" w:type="dxa"/>
+              <w:bottom w:w="45" w:type="dxa"/>
+              <w:end w:w="90" w:type="dxa"/>
+            </w:tcMar>
+            <w:vAlign w:val="top"/>
+          </w:tcPr>
+          <w:p>
+            <w:pPr>
+              <w:spacing w:before="0" w:after="0" w:line="240" w:lineRule="auto"/>
+            </w:pPr>
+            <w:r>
+              <w:rPr>
+                <w:rFonts w:ascii="Arial" w:hAnsi="Arial"/>
+                <w:b/>
+                <w:sz w:val="15"/>
+                <w:szCs w:val="15"/>
+              </w:rPr>
               <w:t xml:space="preserve">Diagnóstico técnico:</w:t>
-            </w:r>
-          </w:p>
-        </w:tc>
-        <w:tc>
-          <w:tcPr>
-            <w:tcW w:type="dxa" w:w="5300"/>
-            <w:tcBorders>
-              <w:top w:val="single" w:sz="6" w:color="000000"/>
-              <w:left w:val="single" w:sz="6" w:color="000000"/>
-              <w:bottom w:val="single" w:sz="6" w:color="000000"/>
-              <w:right w:val="single" w:sz="6" w:color="000000"/>
-            </w:tcBorders>
-            <w:tcMar>
-              <w:top w:w="45" w:type="dxa"/>
-              <w:start w:w="90" w:type="dxa"/>
-              <w:bottom w:w="45" w:type="dxa"/>
-              <w:end w:w="90" w:type="dxa"/>
-            </w:tcMar>
-            <w:vAlign w:val="top"/>
-          </w:tcPr>
-          <w:p>
-            <w:pPr>
-              <w:spacing w:before="0" w:after="0" w:line="240" w:lineRule="auto"/>
-            </w:pPr>
-            <w:r>
-              <w:rPr>
-                <w:rFonts w:ascii="Arial" w:hAnsi="Arial"/>
-                <w:b/>
-                <w:sz w:val="15"/>
-                <w:szCs w:val="15"/>
-              </w:rPr>
-              <w:t xml:space="preserve">Serviço executado / observações:</w:t>
-            </w:r>
-            <w:r>
-              <w:rPr>
-                <w:rFonts w:ascii="Arial" w:hAnsi="Arial"/>
-                <w:b w:val="0"/>
-                <w:sz w:val="14"/>
-                <w:szCs w:val="14"/>
-              </w:rPr>
-              <w:t xml:space="preserve"> Instalação com teste de vazão.</w:t>
             </w:r>
           </w:p>
         </w:tc>

</xml_diff>

<commit_message>
Enxugar a ordem de serviço e adicionar a via do cliente
Tira tipo de atendimento, defeito relatado e diagnóstico técnico. A seção
de pagamento vira uma linha abaixo do total, só com a forma e o valor. O
cabeçalho põe o logo à esquerda e os dados da empresa ao lado, e o pé da
página ganha uma via destacável para o cliente com serviço, valor, data e
a assinatura do técnico, que sai do quadro de assinaturas de cima.

Co-Authored-By: Claude Opus 5 <noreply@anthropic.com>
</commit_message>
<xml_diff>
--- a/scripts/saida-teste/ordem Maria da Silva & Filhos Ltda 25-07-2026.docx
+++ b/scripts/saida-teste/ordem Maria da Silva & Filhos Ltda 25-07-2026.docx
@@ -39,79 +39,48 @@
     </w:p>
     <w:tbl>
       <w:tblPr>
-        <w:tblStyle w:val="Table1"/>
-        <w:tblW w:w="10601.0" w:type="dxa"/>
+        <w:tblW w:w="10600" w:type="dxa"/>
         <w:jc w:val="center"/>
         <w:tblLayout w:type="fixed"/>
         <w:tblLook w:val="0400"/>
       </w:tblPr>
       <w:tblGrid>
-        <w:gridCol w:w="10601"/>
-        <w:tblGridChange w:id="0">
-          <w:tblGrid>
-            <w:gridCol w:w="10601"/>
-          </w:tblGrid>
-        </w:tblGridChange>
+        <w:gridCol w:w="4200"/>
+        <w:gridCol w:w="6400"/>
       </w:tblGrid>
       <w:tr>
         <w:trPr>
-          <w:cantSplit w:val="0"/>
-          <w:trHeight w:val="1332" w:hRule="atLeast"/>
-          <w:tblHeader w:val="0"/>
+          <w:cantSplit/>
+          <w:trHeight w:val="900" w:hRule="atLeast"/>
         </w:trPr>
         <w:tc>
           <w:tcPr>
-            <w:tcBorders>
-              <w:top w:color="000000" w:space="0" w:sz="8" w:val="single"/>
-              <w:left w:color="000000" w:space="0" w:sz="8" w:val="single"/>
-              <w:bottom w:color="000000" w:space="0" w:sz="8" w:val="single"/>
-              <w:right w:color="000000" w:space="0" w:sz="8" w:val="single"/>
-            </w:tcBorders>
-            <w:tcMar>
-              <w:top w:w="40" w:type="dxa"/>
-              <w:bottom w:w="30" w:type="dxa"/>
-              <w:start w:w="70" w:type="dxa"/>
-              <w:end w:w="70" w:type="dxa"/>
-            </w:tcMar>
-            <w:vAlign w:val="center"/>
-          </w:tcPr>
-          <w:p>
-            <w:pPr>
-              <w:spacing w:after="0" w:before="0" w:line="240" w:lineRule="auto"/>
-              <w:jc w:val="center"/>
-              <w:rPr>
-                <w:sz w:val="22"/>
-                <w:szCs w:val="22"/>
-              </w:rPr>
-            </w:pPr>
-            <w:r>
-              <w:rPr>
-                <w:rFonts w:ascii="Arial" w:hAnsi="Arial"/>
-                <w:sz w:val="16"/>
-                <w:rtl w:val="0"/>
-              </w:rPr>
-            </w:r>
-          </w:p>
-          <w:p>
-            <w:pPr>
-              <w:spacing w:after="0" w:before="0" w:line="240" w:lineRule="auto"/>
-              <w:jc w:val="center"/>
-              <w:rPr>
-                <w:sz w:val="22"/>
-                <w:szCs w:val="22"/>
-              </w:rPr>
-            </w:pPr>
-            <w:r>
-              <w:rPr>
-                <w:rFonts w:ascii="Arial" w:hAnsi="Arial"/>
-                <w:sz w:val="16"/>
-                <w:szCs w:val="22"/>
-              </w:rPr>
+            <w:tcW w:type="dxa" w:w="4200"/>
+            <w:tcBorders>
+              <w:top w:val="single" w:sz="6" w:color="000000"/>
+              <w:left w:val="single" w:sz="6" w:color="000000"/>
+              <w:bottom w:val="single" w:sz="6" w:color="000000"/>
+              <w:right w:val="nil"/>
+            </w:tcBorders>
+            <w:tcMar>
+              <w:top w:w="45" w:type="dxa"/>
+              <w:start w:w="90" w:type="dxa"/>
+              <w:bottom w:w="45" w:type="dxa"/>
+              <w:end w:w="90" w:type="dxa"/>
+            </w:tcMar>
+            <w:vAlign w:val="center"/>
+          </w:tcPr>
+          <w:p>
+            <w:pPr>
+              <w:spacing w:before="0" w:after="0" w:line="240" w:lineRule="auto"/>
+              <w:jc w:val="left"/>
+            </w:pPr>
+            <w:r>
               <w:drawing>
-                <wp:inline distB="114300" distT="114300" distL="114300" distR="114300">
+                <wp:inline distB="0" distT="0" distL="0" distR="0">
                   <wp:extent cx="2203054" cy="474075"/>
                   <wp:effectExtent b="0" l="0" r="0" t="0"/>
-                  <wp:docPr id="1" name="image1.png" descr="Logotipo Waterfall Company Brazil"/>
+                  <wp:docPr id="1" name="logo1.png" descr="Logotipo Waterfall Company Brazil"/>
                   <a:graphic>
                     <a:graphicData uri="http://schemas.openxmlformats.org/drawingml/2006/picture">
                       <pic:pic>
@@ -140,111 +109,62 @@
                 </wp:inline>
               </w:drawing>
             </w:r>
-            <w:r>
-              <w:rPr>
-                <w:rFonts w:ascii="Arial" w:hAnsi="Arial"/>
+          </w:p>
+        </w:tc>
+        <w:tc>
+          <w:tcPr>
+            <w:tcW w:type="dxa" w:w="6400"/>
+            <w:tcBorders>
+              <w:top w:val="single" w:sz="6" w:color="000000"/>
+              <w:left w:val="nil"/>
+              <w:bottom w:val="single" w:sz="6" w:color="000000"/>
+              <w:right w:val="single" w:sz="6" w:color="000000"/>
+            </w:tcBorders>
+            <w:tcMar>
+              <w:top w:w="45" w:type="dxa"/>
+              <w:start w:w="90" w:type="dxa"/>
+              <w:bottom w:w="45" w:type="dxa"/>
+              <w:end w:w="90" w:type="dxa"/>
+            </w:tcMar>
+            <w:vAlign w:val="center"/>
+          </w:tcPr>
+          <w:p>
+            <w:pPr>
+              <w:spacing w:before="0" w:after="0" w:line="240" w:lineRule="auto"/>
+              <w:jc w:val="right"/>
+            </w:pPr>
+            <w:r>
+              <w:rPr>
+                <w:rFonts w:ascii="Arial" w:hAnsi="Arial"/>
+                <w:b/>
                 <w:sz w:val="16"/>
-                <w:rtl w:val="0"/>
-              </w:rPr>
-            </w:r>
-          </w:p>
-          <w:p>
-            <w:pPr>
-              <w:spacing w:after="0" w:before="0" w:line="240" w:lineRule="auto"/>
-              <w:jc w:val="center"/>
-              <w:rPr>
-                <w:b w:val="1"/>
-                <w:bCs w:val="1"/>
-                <w:sz w:val="18"/>
-                <w:szCs w:val="18"/>
-              </w:rPr>
-            </w:pPr>
-            <w:r>
-              <w:rPr>
-                <w:rFonts w:ascii="Arial" w:hAnsi="Arial"/>
-                <w:b/>
-                <w:bCs w:val="1"/>
+                <w:szCs w:val="16"/>
+              </w:rPr>
+              <w:t xml:space="preserve">Rua 295, 191 | Meia Praia, Itapema - SC</w:t>
+            </w:r>
+            <w:r>
+              <w:br/>
+            </w:r>
+            <w:r>
+              <w:rPr>
+                <w:rFonts w:ascii="Arial" w:hAnsi="Arial"/>
+                <w:b w:val="0"/>
                 <w:sz w:val="16"/>
-                <w:szCs w:val="22"/>
-                <w:rtl w:val="0"/>
-              </w:rPr>
-              <w:t xml:space="preserve"> </w:t>
-            </w:r>
-            <w:r>
-              <w:rPr>
-                <w:rFonts w:ascii="Arial" w:cs="Arial" w:eastAsia="Arial" w:hAnsi="Arial"/>
-                <w:b/>
-                <w:bCs w:val="1"/>
-                <w:color w:val="000000"/>
+                <w:szCs w:val="16"/>
+              </w:rPr>
+              <w:t xml:space="preserve">WhatsApp: (47) 99186-8646</w:t>
+            </w:r>
+            <w:r>
+              <w:br/>
+            </w:r>
+            <w:r>
+              <w:rPr>
+                <w:rFonts w:ascii="Arial" w:hAnsi="Arial"/>
+                <w:b w:val="0"/>
                 <w:sz w:val="16"/>
-                <w:szCs w:val="22"/>
-                <w:rtl w:val="0"/>
-              </w:rPr>
-              <w:br w:type="textWrapping"/>
-            </w:r>
-            <w:r>
-              <w:rPr>
-                <w:rFonts w:ascii="Arial" w:cs="Arial" w:eastAsia="Arial" w:hAnsi="Arial"/>
-                <w:b/>
-                <w:bCs w:val="1"/>
-                <w:color w:val="000000"/>
-                <w:sz w:val="16"/>
-                <w:szCs w:val="18"/>
-                <w:rtl w:val="0"/>
-              </w:rPr>
-              <w:t xml:space="preserve">Rua</w:t>
-            </w:r>
-            <w:r>
-              <w:rPr>
-                <w:rFonts w:ascii="Arial" w:hAnsi="Arial"/>
-                <w:b/>
-                <w:bCs w:val="1"/>
-                <w:sz w:val="16"/>
-                <w:szCs w:val="18"/>
-                <w:rtl w:val="0"/>
-              </w:rPr>
-              <w:t xml:space="preserve"> 295, 191 | Meia Praia, Itapema - SC        WhatsApp: (47) 99186-8646        </w:t>
-            </w:r>
-            <w:r>
-              <w:rPr>
-                <w:rFonts w:ascii="Arial" w:hAnsi="Arial"/>
-                <w:b/>
-                <w:bCs w:val="1"/>
-                <w:sz w:val="16"/>
-                <w:szCs w:val="18"/>
-                <w:rtl w:val="0"/>
-              </w:rPr>
-              <w:t xml:space="preserve">www.waterfall.ind.br  </w:t>
-            </w:r>
-            <w:r>
-              <w:rPr>
-                <w:rFonts w:ascii="Arial" w:hAnsi="Arial"/>
-                <w:b/>
-                <w:bCs w:val="1"/>
-                <w:sz w:val="16"/>
-                <w:szCs w:val="18"/>
-                <w:rtl w:val="0"/>
-              </w:rPr>
-              <w:t xml:space="preserve">     @waterfallcompanybr</w:t>
-            </w:r>
-          </w:p>
-          <w:p>
-            <w:pPr>
-              <w:spacing w:after="0" w:before="0" w:line="240" w:lineRule="auto"/>
-              <w:jc w:val="center"/>
-              <w:rPr>
-                <w:b w:val="1"/>
-                <w:bCs w:val="1"/>
-                <w:sz w:val="18"/>
-                <w:szCs w:val="18"/>
-              </w:rPr>
-            </w:pPr>
-            <w:r>
-              <w:rPr>
-                <w:rFonts w:ascii="Arial" w:hAnsi="Arial"/>
-                <w:sz w:val="16"/>
-                <w:rtl w:val="0"/>
-              </w:rPr>
+                <w:szCs w:val="16"/>
+              </w:rPr>
+              <w:t xml:space="preserve">www.waterfall.ind.br   ·   @waterfallcompanybr</w:t>
             </w:r>
           </w:p>
         </w:tc>
@@ -443,53 +363,6 @@
                 <w:szCs w:val="15"/>
               </w:rPr>
               <w:t xml:space="preserve"> [X] Aberta  [ ] Concluída</w:t>
-            </w:r>
-          </w:p>
-        </w:tc>
-      </w:tr>
-      <w:tr>
-        <w:trPr>
-          <w:trHeight w:val="272" w:hRule="atLeast"/>
-        </w:trPr>
-        <w:tc>
-          <w:tcPr>
-            <w:tcW w:type="dxa" w:w="10600"/>
-            <w:gridSpan w:val="4"/>
-            <w:tcBorders>
-              <w:top w:val="single" w:sz="6" w:color="000000"/>
-              <w:left w:val="single" w:sz="6" w:color="000000"/>
-              <w:bottom w:val="single" w:sz="6" w:color="000000"/>
-              <w:right w:val="single" w:sz="6" w:color="000000"/>
-            </w:tcBorders>
-            <w:tcMar>
-              <w:top w:w="45" w:type="dxa"/>
-              <w:start w:w="90" w:type="dxa"/>
-              <w:bottom w:w="45" w:type="dxa"/>
-              <w:end w:w="90" w:type="dxa"/>
-            </w:tcMar>
-            <w:vAlign w:val="center"/>
-          </w:tcPr>
-          <w:p>
-            <w:pPr>
-              <w:spacing w:before="0" w:after="0" w:line="240" w:lineRule="auto"/>
-            </w:pPr>
-            <w:r>
-              <w:rPr>
-                <w:rFonts w:ascii="Arial" w:hAnsi="Arial"/>
-                <w:b/>
-                <w:sz w:val="15"/>
-                <w:szCs w:val="15"/>
-              </w:rPr>
-              <w:t xml:space="preserve">TIPO DE ATENDIMENTO:</w:t>
-            </w:r>
-            <w:r>
-              <w:rPr>
-                <w:rFonts w:ascii="Arial" w:hAnsi="Arial"/>
-                <w:b w:val="0"/>
-                <w:sz w:val="15"/>
-                <w:szCs w:val="15"/>
-              </w:rPr>
-              <w:t xml:space="preserve"> [X] Instalação  [ ] Manutenção  [ ] Troca de filtro  [ ] Visita técnica</w:t>
             </w:r>
           </w:p>
         </w:tc>
@@ -1381,75 +1254,6 @@
                 <w:szCs w:val="15"/>
               </w:rPr>
               <w:t xml:space="preserve"> WF-2026-001</w:t>
-            </w:r>
-          </w:p>
-        </w:tc>
-      </w:tr>
-      <w:tr>
-        <w:trPr>
-          <w:trHeight w:val="578" w:hRule="atLeast"/>
-        </w:trPr>
-        <w:tc>
-          <w:tcPr>
-            <w:tcW w:type="dxa" w:w="5300"/>
-            <w:tcBorders>
-              <w:top w:val="single" w:sz="6" w:color="000000"/>
-              <w:left w:val="single" w:sz="6" w:color="000000"/>
-              <w:bottom w:val="single" w:sz="6" w:color="000000"/>
-              <w:right w:val="single" w:sz="6" w:color="000000"/>
-            </w:tcBorders>
-            <w:tcMar>
-              <w:top w:w="45" w:type="dxa"/>
-              <w:start w:w="90" w:type="dxa"/>
-              <w:bottom w:w="45" w:type="dxa"/>
-              <w:end w:w="90" w:type="dxa"/>
-            </w:tcMar>
-            <w:vAlign w:val="top"/>
-          </w:tcPr>
-          <w:p>
-            <w:pPr>
-              <w:spacing w:before="0" w:after="0" w:line="240" w:lineRule="auto"/>
-            </w:pPr>
-            <w:r>
-              <w:rPr>
-                <w:rFonts w:ascii="Arial" w:hAnsi="Arial"/>
-                <w:b/>
-                <w:sz w:val="15"/>
-                <w:szCs w:val="15"/>
-              </w:rPr>
-              <w:t xml:space="preserve">Defeito relatado pelo cliente:</w:t>
-            </w:r>
-          </w:p>
-        </w:tc>
-        <w:tc>
-          <w:tcPr>
-            <w:tcW w:type="dxa" w:w="5300"/>
-            <w:tcBorders>
-              <w:top w:val="single" w:sz="6" w:color="000000"/>
-              <w:left w:val="single" w:sz="6" w:color="000000"/>
-              <w:bottom w:val="single" w:sz="6" w:color="000000"/>
-              <w:right w:val="single" w:sz="6" w:color="000000"/>
-            </w:tcBorders>
-            <w:tcMar>
-              <w:top w:w="45" w:type="dxa"/>
-              <w:start w:w="90" w:type="dxa"/>
-              <w:bottom w:w="45" w:type="dxa"/>
-              <w:end w:w="90" w:type="dxa"/>
-            </w:tcMar>
-            <w:vAlign w:val="top"/>
-          </w:tcPr>
-          <w:p>
-            <w:pPr>
-              <w:spacing w:before="0" w:after="0" w:line="240" w:lineRule="auto"/>
-            </w:pPr>
-            <w:r>
-              <w:rPr>
-                <w:rFonts w:ascii="Arial" w:hAnsi="Arial"/>
-                <w:b/>
-                <w:sz w:val="15"/>
-                <w:szCs w:val="15"/>
-              </w:rPr>
-              <w:t xml:space="preserve">Diagnóstico técnico:</w:t>
             </w:r>
           </w:p>
         </w:tc>
@@ -2611,349 +2415,81 @@
           </w:p>
         </w:tc>
       </w:tr>
-    </w:tbl>
-    <w:p>
-      <w:pPr>
-        <w:spacing w:after="0" w:before="0" w:line="240" w:lineRule="auto"/>
-        <w:jc w:val="left"/>
-        <w:rPr/>
-      </w:pPr>
-      <w:r>
-        <w:rPr>
-          <w:rFonts w:ascii="Arial" w:hAnsi="Arial"/>
-          <w:b w:val="0"/>
-          <w:sz w:val="3"/>
-          <w:rtl w:val="0"/>
-        </w:rPr>
-      </w:r>
-    </w:p>
-    <w:tbl>
-      <w:tblPr>
-        <w:tblW w:type="dxa" w:w="10600"/>
-        <w:jc w:val="center"/>
-        <w:tblLayout w:type="fixed"/>
-        <w:tblLook w:firstColumn="1" w:firstRow="1" w:lastColumn="0" w:lastRow="0" w:noHBand="0" w:noVBand="1" w:val="04A0"/>
-      </w:tblPr>
-      <w:tblGrid>
-        <w:gridCol w:w="3500"/>
-        <w:gridCol w:w="1500"/>
-        <w:gridCol w:w="2600"/>
-        <w:gridCol w:w="3000"/>
-      </w:tblGrid>
       <w:tr>
         <w:trPr>
-          <w:trHeight w:val="215" w:hRule="atLeast"/>
-          <w:tblHeader w:val="true"/>
+          <w:trHeight w:val="272" w:hRule="atLeast"/>
         </w:trPr>
         <w:tc>
           <w:tcPr>
-            <w:tcW w:type="dxa" w:w="10600"/>
-            <w:gridSpan w:val="4"/>
-            <w:tcBorders>
-              <w:top w:val="single" w:sz="6" w:color="000000"/>
-              <w:left w:val="single" w:sz="6" w:color="000000"/>
-              <w:bottom w:val="single" w:sz="6" w:color="000000"/>
-              <w:right w:val="single" w:sz="6" w:color="000000"/>
-            </w:tcBorders>
-            <w:tcMar>
-              <w:top w:w="35" w:type="dxa"/>
-              <w:start w:w="85" w:type="dxa"/>
-              <w:bottom w:w="35" w:type="dxa"/>
-              <w:end w:w="85" w:type="dxa"/>
-            </w:tcMar>
-            <w:vAlign w:val="center"/>
-            <w:shd w:fill="E8E8E8" w:val="clear"/>
-          </w:tcPr>
-          <w:p>
-            <w:pPr>
-              <w:spacing w:before="0" w:after="0" w:line="240" w:lineRule="auto"/>
-              <w:jc w:val="left"/>
-            </w:pPr>
-            <w:r/>
-            <w:r>
-              <w:rPr>
-                <w:rFonts w:ascii="Arial" w:hAnsi="Arial"/>
-                <w:b/>
+            <w:tcW w:type="dxa" w:w="8900"/>
+            <w:gridSpan w:val="5"/>
+            <w:tcBorders>
+              <w:top w:val="single" w:sz="6" w:color="000000"/>
+              <w:left w:val="single" w:sz="6" w:color="000000"/>
+              <w:bottom w:val="single" w:sz="6" w:color="000000"/>
+              <w:right w:val="single" w:sz="6" w:color="000000"/>
+            </w:tcBorders>
+            <w:tcMar>
+              <w:top w:w="45" w:type="dxa"/>
+              <w:start w:w="90" w:type="dxa"/>
+              <w:bottom w:w="45" w:type="dxa"/>
+              <w:end w:w="90" w:type="dxa"/>
+            </w:tcMar>
+            <w:vAlign w:val="center"/>
+          </w:tcPr>
+          <w:p>
+            <w:pPr>
+              <w:spacing w:before="0" w:after="0" w:line="240" w:lineRule="auto"/>
+            </w:pPr>
+            <w:r>
+              <w:rPr>
+                <w:rFonts w:ascii="Arial" w:hAnsi="Arial"/>
+                <w:b/>
+                <w:sz w:val="15"/>
+                <w:szCs w:val="15"/>
+              </w:rPr>
+              <w:t xml:space="preserve">PAGAMENTO:</w:t>
+            </w:r>
+            <w:r>
+              <w:rPr>
+                <w:rFonts w:ascii="Arial" w:hAnsi="Arial"/>
+                <w:b w:val="0"/>
+                <w:sz w:val="15"/>
+                <w:szCs w:val="15"/>
+              </w:rPr>
+              <w:t xml:space="preserve"> [X] PIX  [ ] Crédito  [ ] Débito  [ ] Dinheiro  [ ] Boleto  [ ] Transferência</w:t>
+            </w:r>
+          </w:p>
+        </w:tc>
+        <w:tc>
+          <w:tcPr>
+            <w:tcW w:type="dxa" w:w="1700"/>
+            <w:tcBorders>
+              <w:top w:val="single" w:sz="6" w:color="000000"/>
+              <w:left w:val="single" w:sz="6" w:color="000000"/>
+              <w:bottom w:val="single" w:sz="6" w:color="000000"/>
+              <w:right w:val="single" w:sz="6" w:color="000000"/>
+            </w:tcBorders>
+            <w:tcMar>
+              <w:top w:w="45" w:type="dxa"/>
+              <w:start w:w="90" w:type="dxa"/>
+              <w:bottom w:w="45" w:type="dxa"/>
+              <w:end w:w="90" w:type="dxa"/>
+            </w:tcMar>
+            <w:vAlign w:val="center"/>
+          </w:tcPr>
+          <w:p>
+            <w:pPr>
+              <w:spacing w:before="0" w:after="0" w:line="240" w:lineRule="auto"/>
+            </w:pPr>
+            <w:r>
+              <w:rPr>
+                <w:rFonts w:ascii="Arial" w:hAnsi="Arial"/>
+                <w:b w:val="0"/>
                 <w:sz w:val="16"/>
-              </w:rPr>
-              <w:t>4. PAGAMENTO</w:t>
-            </w:r>
-          </w:p>
-        </w:tc>
-      </w:tr>
-      <w:tr>
-        <w:trPr>
-          <w:trHeight w:val="283" w:hRule="atLeast"/>
-        </w:trPr>
-        <w:tc>
-          <w:tcPr>
-            <w:tcW w:type="dxa" w:w="10600"/>
-            <w:gridSpan w:val="4"/>
-            <w:tcBorders>
-              <w:top w:val="single" w:sz="6" w:color="000000"/>
-              <w:left w:val="single" w:sz="6" w:color="000000"/>
-              <w:bottom w:val="single" w:sz="6" w:color="000000"/>
-              <w:right w:val="single" w:sz="6" w:color="000000"/>
-            </w:tcBorders>
-            <w:tcMar>
-              <w:top w:w="45" w:type="dxa"/>
-              <w:start w:w="90" w:type="dxa"/>
-              <w:bottom w:w="45" w:type="dxa"/>
-              <w:end w:w="90" w:type="dxa"/>
-            </w:tcMar>
-            <w:vAlign w:val="center"/>
-          </w:tcPr>
-          <w:p>
-            <w:pPr>
-              <w:spacing w:before="0" w:after="0" w:line="240" w:lineRule="auto"/>
-            </w:pPr>
-            <w:r>
-              <w:rPr>
-                <w:rFonts w:ascii="Arial" w:hAnsi="Arial"/>
-                <w:b/>
-                <w:sz w:val="14"/>
-                <w:szCs w:val="14"/>
-              </w:rPr>
-              <w:t xml:space="preserve">Forma:</w:t>
-            </w:r>
-            <w:r>
-              <w:rPr>
-                <w:rFonts w:ascii="Arial" w:hAnsi="Arial"/>
-                <w:b w:val="0"/>
-                <w:sz w:val="14"/>
-                <w:szCs w:val="14"/>
-              </w:rPr>
-              <w:t xml:space="preserve"> [X] PIX  [ ] Crédito  [ ] Débito  [ ] Dinheiro  [ ] Boleto  [ ] Transferência</w:t>
-            </w:r>
-          </w:p>
-        </w:tc>
-      </w:tr>
-      <w:tr>
-        <w:trPr>
-          <w:trHeight w:val="295" w:hRule="atLeast"/>
-        </w:trPr>
-        <w:tc>
-          <w:tcPr>
-            <w:tcW w:type="dxa" w:w="3500"/>
-            <w:tcBorders>
-              <w:top w:val="single" w:sz="6" w:color="000000"/>
-              <w:left w:val="single" w:sz="6" w:color="000000"/>
-              <w:bottom w:val="single" w:sz="6" w:color="000000"/>
-              <w:right w:val="single" w:sz="6" w:color="000000"/>
-            </w:tcBorders>
-            <w:tcMar>
-              <w:top w:w="45" w:type="dxa"/>
-              <w:start w:w="90" w:type="dxa"/>
-              <w:bottom w:w="45" w:type="dxa"/>
-              <w:end w:w="90" w:type="dxa"/>
-            </w:tcMar>
-            <w:vAlign w:val="center"/>
-          </w:tcPr>
-          <w:p>
-            <w:pPr>
-              <w:spacing w:before="0" w:after="0" w:line="240" w:lineRule="auto"/>
-            </w:pPr>
-            <w:r>
-              <w:rPr>
-                <w:rFonts w:ascii="Arial" w:hAnsi="Arial"/>
-                <w:b/>
-                <w:sz w:val="14"/>
-                <w:szCs w:val="14"/>
-              </w:rPr>
-              <w:t xml:space="preserve">Condição:</w:t>
-            </w:r>
-            <w:r>
-              <w:rPr>
-                <w:rFonts w:ascii="Arial" w:hAnsi="Arial"/>
-                <w:b w:val="0"/>
-                <w:sz w:val="14"/>
-                <w:szCs w:val="14"/>
-              </w:rPr>
-              <w:t xml:space="preserve"> [X] À vista  [ ] Parcelado</w:t>
-            </w:r>
-          </w:p>
-        </w:tc>
-        <w:tc>
-          <w:tcPr>
-            <w:tcW w:type="dxa" w:w="1500"/>
-            <w:tcBorders>
-              <w:top w:val="single" w:sz="6" w:color="000000"/>
-              <w:left w:val="single" w:sz="6" w:color="000000"/>
-              <w:bottom w:val="single" w:sz="6" w:color="000000"/>
-              <w:right w:val="single" w:sz="6" w:color="000000"/>
-            </w:tcBorders>
-            <w:tcMar>
-              <w:top w:w="45" w:type="dxa"/>
-              <w:start w:w="90" w:type="dxa"/>
-              <w:bottom w:w="45" w:type="dxa"/>
-              <w:end w:w="90" w:type="dxa"/>
-            </w:tcMar>
-            <w:vAlign w:val="center"/>
-          </w:tcPr>
-          <w:p>
-            <w:pPr>
-              <w:spacing w:before="0" w:after="0" w:line="240" w:lineRule="auto"/>
-            </w:pPr>
-            <w:r>
-              <w:rPr>
-                <w:rFonts w:ascii="Arial" w:hAnsi="Arial"/>
-                <w:b/>
-                <w:sz w:val="14"/>
-                <w:szCs w:val="14"/>
-              </w:rPr>
-              <w:t xml:space="preserve">Parcelas:</w:t>
-            </w:r>
-          </w:p>
-        </w:tc>
-        <w:tc>
-          <w:tcPr>
-            <w:tcW w:type="dxa" w:w="2600"/>
-            <w:tcBorders>
-              <w:top w:val="single" w:sz="6" w:color="000000"/>
-              <w:left w:val="single" w:sz="6" w:color="000000"/>
-              <w:bottom w:val="single" w:sz="6" w:color="000000"/>
-              <w:right w:val="single" w:sz="6" w:color="000000"/>
-            </w:tcBorders>
-            <w:tcMar>
-              <w:top w:w="45" w:type="dxa"/>
-              <w:start w:w="90" w:type="dxa"/>
-              <w:bottom w:w="45" w:type="dxa"/>
-              <w:end w:w="90" w:type="dxa"/>
-            </w:tcMar>
-            <w:vAlign w:val="center"/>
-          </w:tcPr>
-          <w:p>
-            <w:pPr>
-              <w:spacing w:before="0" w:after="0" w:line="240" w:lineRule="auto"/>
-            </w:pPr>
-            <w:r>
-              <w:rPr>
-                <w:rFonts w:ascii="Arial" w:hAnsi="Arial"/>
-                <w:b/>
-                <w:sz w:val="14"/>
-                <w:szCs w:val="14"/>
-              </w:rPr>
-              <w:t xml:space="preserve">1º vencimento:</w:t>
-            </w:r>
-          </w:p>
-        </w:tc>
-        <w:tc>
-          <w:tcPr>
-            <w:tcW w:type="dxa" w:w="3000"/>
-            <w:tcBorders>
-              <w:top w:val="single" w:sz="6" w:color="000000"/>
-              <w:left w:val="single" w:sz="6" w:color="000000"/>
-              <w:bottom w:val="single" w:sz="6" w:color="000000"/>
-              <w:right w:val="single" w:sz="6" w:color="000000"/>
-            </w:tcBorders>
-            <w:tcMar>
-              <w:top w:w="45" w:type="dxa"/>
-              <w:start w:w="90" w:type="dxa"/>
-              <w:bottom w:w="45" w:type="dxa"/>
-              <w:end w:w="90" w:type="dxa"/>
-            </w:tcMar>
-            <w:vAlign w:val="center"/>
-          </w:tcPr>
-          <w:p>
-            <w:pPr>
-              <w:spacing w:before="0" w:after="0" w:line="240" w:lineRule="auto"/>
-            </w:pPr>
-            <w:r>
-              <w:rPr>
-                <w:rFonts w:ascii="Arial" w:hAnsi="Arial"/>
-                <w:b/>
-                <w:sz w:val="14"/>
-                <w:szCs w:val="14"/>
-              </w:rPr>
-              <w:t xml:space="preserve">Valor total:</w:t>
-            </w:r>
-            <w:r>
-              <w:rPr>
-                <w:rFonts w:ascii="Arial" w:hAnsi="Arial"/>
-                <w:b w:val="0"/>
-                <w:sz w:val="14"/>
-                <w:szCs w:val="14"/>
-              </w:rPr>
-              <w:t xml:space="preserve"> R$ 2.990,00</w:t>
-            </w:r>
-          </w:p>
-        </w:tc>
-      </w:tr>
-      <w:tr>
-        <w:trPr>
-          <w:trHeight w:val="295" w:hRule="atLeast"/>
-        </w:trPr>
-        <w:tc>
-          <w:tcPr>
-            <w:tcW w:type="dxa" w:w="7600"/>
-            <w:gridSpan w:val="3"/>
-            <w:tcBorders>
-              <w:top w:val="single" w:sz="6" w:color="000000"/>
-              <w:left w:val="single" w:sz="6" w:color="000000"/>
-              <w:bottom w:val="single" w:sz="6" w:color="000000"/>
-              <w:right w:val="single" w:sz="6" w:color="000000"/>
-            </w:tcBorders>
-            <w:tcMar>
-              <w:top w:w="45" w:type="dxa"/>
-              <w:start w:w="90" w:type="dxa"/>
-              <w:bottom w:w="45" w:type="dxa"/>
-              <w:end w:w="90" w:type="dxa"/>
-            </w:tcMar>
-            <w:vAlign w:val="center"/>
-          </w:tcPr>
-          <w:p>
-            <w:pPr>
-              <w:spacing w:before="0" w:after="0" w:line="240" w:lineRule="auto"/>
-            </w:pPr>
-            <w:r>
-              <w:rPr>
-                <w:rFonts w:ascii="Arial" w:hAnsi="Arial"/>
-                <w:b/>
-                <w:sz w:val="14"/>
-                <w:szCs w:val="14"/>
-              </w:rPr>
-              <w:t xml:space="preserve">Comprovante / NSU / ID da transação:</w:t>
-            </w:r>
-          </w:p>
-        </w:tc>
-        <w:tc>
-          <w:tcPr>
-            <w:tcW w:type="dxa" w:w="3000"/>
-            <w:tcBorders>
-              <w:top w:val="single" w:sz="6" w:color="000000"/>
-              <w:left w:val="single" w:sz="6" w:color="000000"/>
-              <w:bottom w:val="single" w:sz="6" w:color="000000"/>
-              <w:right w:val="single" w:sz="6" w:color="000000"/>
-            </w:tcBorders>
-            <w:tcMar>
-              <w:top w:w="45" w:type="dxa"/>
-              <w:start w:w="90" w:type="dxa"/>
-              <w:bottom w:w="45" w:type="dxa"/>
-              <w:end w:w="90" w:type="dxa"/>
-            </w:tcMar>
-            <w:vAlign w:val="center"/>
-          </w:tcPr>
-          <w:p>
-            <w:pPr>
-              <w:spacing w:before="0" w:after="0" w:line="240" w:lineRule="auto"/>
-            </w:pPr>
-            <w:r>
-              <w:rPr>
-                <w:rFonts w:ascii="Arial" w:hAnsi="Arial"/>
-                <w:b/>
-                <w:sz w:val="14"/>
-                <w:szCs w:val="14"/>
-              </w:rPr>
-              <w:t xml:space="preserve">Responsável pelo pagamento:</w:t>
-            </w:r>
-            <w:r>
-              <w:rPr>
-                <w:rFonts w:ascii="Arial" w:hAnsi="Arial"/>
-                <w:b w:val="0"/>
-                <w:sz w:val="14"/>
-                <w:szCs w:val="14"/>
-              </w:rPr>
-              <w:t xml:space="preserve"> Maria da Silva</w:t>
+                <w:szCs w:val="16"/>
+              </w:rPr>
+              <w:t xml:space="preserve">R$ 2.990,00</w:t>
             </w:r>
           </w:p>
         </w:tc>
@@ -2995,7 +2531,7 @@
           <w:b/>
           <w:sz w:val="15"/>
         </w:rPr>
-        <w:t>5. AUTORIZAÇÃO E ACEITE</w:t>
+        <w:t>4. AUTORIZAÇÃO E ACEITE</w:t>
         <w:br/>
       </w:r>
       <w:r>
@@ -3119,24 +2655,64 @@
           </w:p>
         </w:tc>
       </w:tr>
+    </w:tbl>
+    <w:p>
+      <w:pPr>
+        <w:pBdr>
+          <w:top w:val="dashed" w:sz="6" w:space="4" w:color="000000"/>
+        </w:pBdr>
+        <w:spacing w:before="1500" w:after="80" w:line="240" w:lineRule="auto"/>
+        <w:jc w:val="center"/>
+      </w:pPr>
+      <w:r>
+        <w:rPr>
+          <w:rFonts w:ascii="Segoe UI Symbol" w:hAnsi="Segoe UI Symbol"/>
+          <w:sz w:val="14"/>
+        </w:rPr>
+        <w:t xml:space="preserve">✂ </w:t>
+      </w:r>
+      <w:r>
+        <w:rPr>
+          <w:rFonts w:ascii="Arial" w:hAnsi="Arial"/>
+          <w:b w:val="0"/>
+          <w:sz w:val="14"/>
+          <w:szCs w:val="14"/>
+        </w:rPr>
+        <w:t xml:space="preserve">recorte aqui — via do cliente</w:t>
+      </w:r>
+    </w:p>
+    <w:tbl>
+      <w:tblPr>
+        <w:tblW w:w="10600" w:type="dxa"/>
+        <w:jc w:val="center"/>
+        <w:tblLayout w:type="fixed"/>
+        <w:tblLook w:val="0400"/>
+      </w:tblPr>
+      <w:tblGrid>
+        <w:gridCol w:w="2600"/>
+        <w:gridCol w:w="3800"/>
+        <w:gridCol w:w="2100"/>
+        <w:gridCol w:w="2100"/>
+      </w:tblGrid>
       <w:tr>
         <w:trPr>
-          <w:trHeight w:val="522" w:hRule="atLeast"/>
+          <w:cantSplit/>
+          <w:trHeight w:val="700" w:hRule="atLeast"/>
         </w:trPr>
         <w:tc>
           <w:tcPr>
-            <w:tcW w:type="dxa" w:w="3000"/>
-            <w:tcBorders>
-              <w:top w:val="nil" w:sz="6" w:color="000000"/>
-              <w:left w:val="nil" w:sz="6" w:color="000000"/>
-              <w:bottom w:val="nil" w:sz="6" w:color="000000"/>
-              <w:right w:val="nil" w:sz="6" w:color="000000"/>
-            </w:tcBorders>
-            <w:tcMar>
-              <w:top w:w="85" w:type="dxa"/>
-              <w:start w:w="20" w:type="dxa"/>
-              <w:bottom w:w="35" w:type="dxa"/>
-              <w:end w:w="20" w:type="dxa"/>
+            <w:tcW w:type="dxa" w:w="2600"/>
+            <w:tcBorders>
+              <w:top w:val="single" w:sz="6" w:color="000000"/>
+              <w:left w:val="single" w:sz="6" w:color="000000"/>
+              <w:bottom w:val="single" w:sz="6" w:color="000000"/>
+              <w:right w:val="single" w:sz="6" w:color="000000"/>
+            </w:tcBorders>
+            <w:tcMar>
+              <w:top w:w="45" w:type="dxa"/>
+              <w:start w:w="90" w:type="dxa"/>
+              <w:bottom w:w="45" w:type="dxa"/>
+              <w:end w:w="90" w:type="dxa"/>
             </w:tcMar>
             <w:vAlign w:val="center"/>
           </w:tcPr>
@@ -3145,47 +2721,364 @@
               <w:spacing w:before="0" w:after="0" w:line="240" w:lineRule="auto"/>
               <w:jc w:val="left"/>
             </w:pPr>
-            <w:r/>
-            <w:r>
-              <w:rPr>
-                <w:rFonts w:ascii="Arial" w:hAnsi="Arial"/>
-                <w:b w:val="0"/>
+            <w:r>
+              <w:drawing>
+                <wp:inline distB="0" distT="0" distL="0" distR="0">
+                  <wp:extent cx="1211680" cy="260741"/>
+                  <wp:effectExtent b="0" l="0" r="0" t="0"/>
+                  <wp:docPr id="2" name="logo2.png" descr="Logotipo Waterfall Company Brazil"/>
+                  <a:graphic>
+                    <a:graphicData uri="http://schemas.openxmlformats.org/drawingml/2006/picture">
+                      <pic:pic>
+                        <pic:nvPicPr>
+                          <pic:cNvPr id="0" name="image1.png"/>
+                          <pic:cNvPicPr preferRelativeResize="0"/>
+                        </pic:nvPicPr>
+                        <pic:blipFill>
+                          <a:blip r:embed="rId6"/>
+                          <a:srcRect b="0" l="0" r="0" t="0"/>
+                          <a:stretch>
+                            <a:fillRect/>
+                          </a:stretch>
+                        </pic:blipFill>
+                        <pic:spPr>
+                          <a:xfrm>
+                            <a:off x="0" y="0"/>
+                            <a:ext cx="1211680" cy="260741"/>
+                          </a:xfrm>
+                          <a:prstGeom prst="rect"/>
+                          <a:ln/>
+                        </pic:spPr>
+                      </pic:pic>
+                    </a:graphicData>
+                  </a:graphic>
+                </wp:inline>
+              </w:drawing>
+            </w:r>
+          </w:p>
+        </w:tc>
+        <w:tc>
+          <w:tcPr>
+            <w:tcW w:type="dxa" w:w="5900"/>
+            <w:gridSpan w:val="2"/>
+            <w:tcBorders>
+              <w:top w:val="single" w:sz="6" w:color="000000"/>
+              <w:left w:val="single" w:sz="6" w:color="000000"/>
+              <w:bottom w:val="single" w:sz="6" w:color="000000"/>
+              <w:right w:val="single" w:sz="6" w:color="000000"/>
+            </w:tcBorders>
+            <w:tcMar>
+              <w:top w:w="45" w:type="dxa"/>
+              <w:start w:w="90" w:type="dxa"/>
+              <w:bottom w:w="45" w:type="dxa"/>
+              <w:end w:w="90" w:type="dxa"/>
+            </w:tcMar>
+            <w:vAlign w:val="center"/>
+          </w:tcPr>
+          <w:p>
+            <w:pPr>
+              <w:spacing w:before="0" w:after="0" w:line="240" w:lineRule="auto"/>
+              <w:jc w:val="right"/>
+            </w:pPr>
+            <w:r>
+              <w:rPr>
+                <w:rFonts w:ascii="Arial" w:hAnsi="Arial"/>
+                <w:b/>
+                <w:sz w:val="14"/>
+                <w:szCs w:val="14"/>
+              </w:rPr>
+              <w:t xml:space="preserve">Rua 295, 191 | Meia Praia, Itapema - SC</w:t>
+            </w:r>
+            <w:r>
+              <w:br/>
+            </w:r>
+            <w:r>
+              <w:rPr>
+                <w:rFonts w:ascii="Arial" w:hAnsi="Arial"/>
+                <w:b w:val="0"/>
+                <w:sz w:val="14"/>
+                <w:szCs w:val="14"/>
+              </w:rPr>
+              <w:t xml:space="preserve">WhatsApp: (47) 99186-8646</w:t>
+            </w:r>
+            <w:r>
+              <w:br/>
+            </w:r>
+            <w:r>
+              <w:rPr>
+                <w:rFonts w:ascii="Arial" w:hAnsi="Arial"/>
+                <w:b w:val="0"/>
+                <w:sz w:val="14"/>
+                <w:szCs w:val="14"/>
+              </w:rPr>
+              <w:t xml:space="preserve">www.waterfall.ind.br   ·   @waterfallcompanybr</w:t>
+            </w:r>
+          </w:p>
+        </w:tc>
+        <w:tc>
+          <w:tcPr>
+            <w:tcW w:type="dxa" w:w="2100"/>
+            <w:tcBorders>
+              <w:top w:val="single" w:sz="6" w:color="000000"/>
+              <w:left w:val="single" w:sz="6" w:color="000000"/>
+              <w:bottom w:val="single" w:sz="6" w:color="000000"/>
+              <w:right w:val="single" w:sz="6" w:color="000000"/>
+            </w:tcBorders>
+            <w:shd w:val="clear" w:color="auto" w:fill="E8E8E8"/>
+            <w:tcMar>
+              <w:top w:w="45" w:type="dxa"/>
+              <w:start w:w="90" w:type="dxa"/>
+              <w:bottom w:w="45" w:type="dxa"/>
+              <w:end w:w="90" w:type="dxa"/>
+            </w:tcMar>
+            <w:vAlign w:val="center"/>
+          </w:tcPr>
+          <w:p>
+            <w:pPr>
+              <w:spacing w:before="0" w:after="0" w:line="240" w:lineRule="auto"/>
+              <w:jc w:val="center"/>
+            </w:pPr>
+            <w:r>
+              <w:rPr>
+                <w:rFonts w:ascii="Arial" w:hAnsi="Arial"/>
+                <w:b/>
                 <w:sz w:val="16"/>
-              </w:rPr>
-              <w:t>Assinatura do Técnico:</w:t>
-            </w:r>
-          </w:p>
-        </w:tc>
-        <w:tc>
-          <w:tcPr>
-            <w:tcW w:type="dxa" w:w="7600"/>
-            <w:tcBorders>
-              <w:top w:val="nil" w:sz="6" w:color="000000"/>
-              <w:left w:val="nil" w:sz="6" w:color="000000"/>
-              <w:bottom w:val="nil" w:sz="6" w:color="000000"/>
-              <w:right w:val="nil" w:sz="6" w:color="000000"/>
-            </w:tcBorders>
-            <w:tcMar>
-              <w:top w:w="85" w:type="dxa"/>
-              <w:start w:w="20" w:type="dxa"/>
-              <w:bottom w:w="35" w:type="dxa"/>
-              <w:end w:w="20" w:type="dxa"/>
-            </w:tcMar>
-            <w:vAlign w:val="center"/>
+                <w:szCs w:val="16"/>
+              </w:rPr>
+              <w:t xml:space="preserve">VIA DO CLIENTE</w:t>
+            </w:r>
+            <w:r>
+              <w:br/>
+            </w:r>
+            <w:r>
+              <w:rPr>
+                <w:rFonts w:ascii="Arial" w:hAnsi="Arial"/>
+                <w:b/>
+                <w:sz w:val="15"/>
+                <w:szCs w:val="15"/>
+              </w:rPr>
+              <w:t xml:space="preserve">OS Nº:</w:t>
+            </w:r>
+            <w:r>
+              <w:rPr>
+                <w:rFonts w:ascii="Arial" w:hAnsi="Arial"/>
+                <w:b w:val="0"/>
+                <w:sz w:val="15"/>
+                <w:szCs w:val="15"/>
+              </w:rPr>
+              <w:t xml:space="preserve"> 0001</w:t>
+            </w:r>
+          </w:p>
+        </w:tc>
+      </w:tr>
+      <w:tr>
+        <w:trPr>
+          <w:cantSplit/>
+          <w:trHeight w:val="340" w:hRule="atLeast"/>
+        </w:trPr>
+        <w:tc>
+          <w:tcPr>
+            <w:tcW w:type="dxa" w:w="6400"/>
+            <w:gridSpan w:val="2"/>
+            <w:tcBorders>
+              <w:top w:val="single" w:sz="6" w:color="000000"/>
+              <w:left w:val="single" w:sz="6" w:color="000000"/>
+              <w:bottom w:val="single" w:sz="6" w:color="000000"/>
+              <w:right w:val="single" w:sz="6" w:color="000000"/>
+            </w:tcBorders>
+            <w:tcMar>
+              <w:top w:w="45" w:type="dxa"/>
+              <w:start w:w="90" w:type="dxa"/>
+              <w:bottom w:w="45" w:type="dxa"/>
+              <w:end w:w="90" w:type="dxa"/>
+            </w:tcMar>
+            <w:vAlign w:val="center"/>
+          </w:tcPr>
+          <w:p>
+            <w:pPr>
+              <w:spacing w:before="0" w:after="0" w:line="240" w:lineRule="auto"/>
+            </w:pPr>
+            <w:r>
+              <w:rPr>
+                <w:rFonts w:ascii="Arial" w:hAnsi="Arial"/>
+                <w:b/>
+                <w:sz w:val="15"/>
+                <w:szCs w:val="15"/>
+              </w:rPr>
+              <w:t xml:space="preserve">Serviço:</w:t>
+            </w:r>
+            <w:r>
+              <w:rPr>
+                <w:rFonts w:ascii="Arial" w:hAnsi="Arial"/>
+                <w:b w:val="0"/>
+                <w:sz w:val="15"/>
+                <w:szCs w:val="15"/>
+              </w:rPr>
+              <w:t xml:space="preserve"> IonCenter</w:t>
+            </w:r>
+          </w:p>
+        </w:tc>
+        <w:tc>
+          <w:tcPr>
+            <w:tcW w:type="dxa" w:w="2100"/>
+            <w:tcBorders>
+              <w:top w:val="single" w:sz="6" w:color="000000"/>
+              <w:left w:val="single" w:sz="6" w:color="000000"/>
+              <w:bottom w:val="single" w:sz="6" w:color="000000"/>
+              <w:right w:val="single" w:sz="6" w:color="000000"/>
+            </w:tcBorders>
+            <w:tcMar>
+              <w:top w:w="45" w:type="dxa"/>
+              <w:start w:w="90" w:type="dxa"/>
+              <w:bottom w:w="45" w:type="dxa"/>
+              <w:end w:w="90" w:type="dxa"/>
+            </w:tcMar>
+            <w:vAlign w:val="center"/>
+          </w:tcPr>
+          <w:p>
+            <w:pPr>
+              <w:spacing w:before="0" w:after="0" w:line="240" w:lineRule="auto"/>
+            </w:pPr>
+            <w:r>
+              <w:rPr>
+                <w:rFonts w:ascii="Arial" w:hAnsi="Arial"/>
+                <w:b/>
+                <w:sz w:val="15"/>
+                <w:szCs w:val="15"/>
+              </w:rPr>
+              <w:t xml:space="preserve">Valor:</w:t>
+            </w:r>
+            <w:r>
+              <w:rPr>
+                <w:rFonts w:ascii="Arial" w:hAnsi="Arial"/>
+                <w:b w:val="0"/>
+                <w:sz w:val="15"/>
+                <w:szCs w:val="15"/>
+              </w:rPr>
+              <w:t xml:space="preserve"> R$ 2.990,00</w:t>
+            </w:r>
+          </w:p>
+        </w:tc>
+        <w:tc>
+          <w:tcPr>
+            <w:tcW w:type="dxa" w:w="2100"/>
+            <w:tcBorders>
+              <w:top w:val="single" w:sz="6" w:color="000000"/>
+              <w:left w:val="single" w:sz="6" w:color="000000"/>
+              <w:bottom w:val="single" w:sz="6" w:color="000000"/>
+              <w:right w:val="single" w:sz="6" w:color="000000"/>
+            </w:tcBorders>
+            <w:tcMar>
+              <w:top w:w="45" w:type="dxa"/>
+              <w:start w:w="90" w:type="dxa"/>
+              <w:bottom w:w="45" w:type="dxa"/>
+              <w:end w:w="90" w:type="dxa"/>
+            </w:tcMar>
+            <w:vAlign w:val="center"/>
+          </w:tcPr>
+          <w:p>
+            <w:pPr>
+              <w:spacing w:before="0" w:after="0" w:line="240" w:lineRule="auto"/>
+            </w:pPr>
+            <w:r>
+              <w:rPr>
+                <w:rFonts w:ascii="Arial" w:hAnsi="Arial"/>
+                <w:b/>
+                <w:sz w:val="15"/>
+                <w:szCs w:val="15"/>
+              </w:rPr>
+              <w:t xml:space="preserve">Data:</w:t>
+            </w:r>
+            <w:r>
+              <w:rPr>
+                <w:rFonts w:ascii="Arial" w:hAnsi="Arial"/>
+                <w:b w:val="0"/>
+                <w:sz w:val="15"/>
+                <w:szCs w:val="15"/>
+              </w:rPr>
+              <w:t xml:space="preserve"> 25/07/2026</w:t>
+            </w:r>
+          </w:p>
+        </w:tc>
+      </w:tr>
+      <w:tr>
+        <w:trPr>
+          <w:cantSplit/>
+          <w:trHeight w:val="900" w:hRule="atLeast"/>
+        </w:trPr>
+        <w:tc>
+          <w:tcPr>
+            <w:tcW w:type="dxa" w:w="6400"/>
+            <w:gridSpan w:val="2"/>
+            <w:tcBorders>
+              <w:top w:val="single" w:sz="6" w:color="000000"/>
+              <w:left w:val="single" w:sz="6" w:color="000000"/>
+              <w:bottom w:val="single" w:sz="6" w:color="000000"/>
+              <w:right w:val="single" w:sz="6" w:color="000000"/>
+            </w:tcBorders>
+            <w:tcMar>
+              <w:top w:w="45" w:type="dxa"/>
+              <w:start w:w="90" w:type="dxa"/>
+              <w:bottom w:w="45" w:type="dxa"/>
+              <w:end w:w="90" w:type="dxa"/>
+            </w:tcMar>
+            <w:vAlign w:val="center"/>
+          </w:tcPr>
+          <w:p>
+            <w:pPr>
+              <w:spacing w:before="0" w:after="0" w:line="240" w:lineRule="auto"/>
+            </w:pPr>
+            <w:r>
+              <w:rPr>
+                <w:rFonts w:ascii="Arial" w:hAnsi="Arial"/>
+                <w:b/>
+                <w:sz w:val="15"/>
+                <w:szCs w:val="15"/>
+              </w:rPr>
+              <w:t xml:space="preserve">Técnico responsável:</w:t>
+            </w:r>
+            <w:r>
+              <w:rPr>
+                <w:rFonts w:ascii="Arial" w:hAnsi="Arial"/>
+                <w:b w:val="0"/>
+                <w:sz w:val="15"/>
+                <w:szCs w:val="15"/>
+              </w:rPr>
+              <w:t xml:space="preserve"> João</w:t>
+            </w:r>
+          </w:p>
+        </w:tc>
+        <w:tc>
+          <w:tcPr>
+            <w:tcW w:type="dxa" w:w="4200"/>
+            <w:gridSpan w:val="2"/>
+            <w:tcBorders>
+              <w:top w:val="single" w:sz="6" w:color="000000"/>
+              <w:left w:val="single" w:sz="6" w:color="000000"/>
+              <w:bottom w:val="single" w:sz="6" w:color="000000"/>
+              <w:right w:val="single" w:sz="6" w:color="000000"/>
+            </w:tcBorders>
+            <w:tcMar>
+              <w:top w:w="45" w:type="dxa"/>
+              <w:start w:w="90" w:type="dxa"/>
+              <w:bottom w:w="45" w:type="dxa"/>
+              <w:end w:w="90" w:type="dxa"/>
+            </w:tcMar>
+            <w:vAlign w:val="top"/>
           </w:tcPr>
           <w:p>
             <w:pPr>
               <w:spacing w:before="0" w:after="0" w:line="240" w:lineRule="auto"/>
               <w:jc w:val="left"/>
             </w:pPr>
-            <w:r/>
-            <w:r>
-              <w:rPr>
-                <w:rFonts w:ascii="Arial" w:hAnsi="Arial"/>
-                <w:b w:val="0"/>
-                <w:sz w:val="16"/>
-              </w:rPr>
-              <w:t>____________________________________________    Data: ___/___/_____</w:t>
+            <w:r>
+              <w:rPr>
+                <w:rFonts w:ascii="Arial" w:hAnsi="Arial"/>
+                <w:b/>
+                <w:sz w:val="15"/>
+                <w:szCs w:val="15"/>
+              </w:rPr>
+              <w:t xml:space="preserve">Assinatura do técnico:</w:t>
             </w:r>
           </w:p>
         </w:tc>

</xml_diff>

<commit_message>
Dar mais respiro entre o texto e as bordas na ordem de serviço
No DOCX, as margens das células sobem e passam de w:start/w:end para
w:left/w:right, que todo leitor entende (alguns ignoravam as antigas e
colavam o texto na borda). No PDF, mais padding e linhas mais altas,
aproveitando o vão que sobrava antes da via do cliente.

Co-Authored-By: Claude Opus 5 <noreply@anthropic.com>
</commit_message>
<xml_diff>
--- a/scripts/saida-teste/ordem Maria da Silva & Filhos Ltda 25-07-2026.docx
+++ b/scripts/saida-teste/ordem Maria da Silva & Filhos Ltda 25-07-2026.docx
@@ -63,10 +63,10 @@
               <w:right w:val="nil"/>
             </w:tcBorders>
             <w:tcMar>
-              <w:top w:w="45" w:type="dxa"/>
-              <w:start w:w="90" w:type="dxa"/>
-              <w:bottom w:w="45" w:type="dxa"/>
-              <w:end w:w="90" w:type="dxa"/>
+              <w:top w:w="65" w:type="dxa"/>
+              <w:left w:w="130" w:type="dxa"/>
+              <w:bottom w:w="65" w:type="dxa"/>
+              <w:right w:w="130" w:type="dxa"/>
             </w:tcMar>
             <w:vAlign w:val="center"/>
           </w:tcPr>
@@ -121,10 +121,10 @@
               <w:right w:val="single" w:sz="6" w:color="000000"/>
             </w:tcBorders>
             <w:tcMar>
-              <w:top w:w="45" w:type="dxa"/>
-              <w:start w:w="90" w:type="dxa"/>
-              <w:bottom w:w="45" w:type="dxa"/>
-              <w:end w:w="90" w:type="dxa"/>
+              <w:top w:w="65" w:type="dxa"/>
+              <w:left w:w="130" w:type="dxa"/>
+              <w:bottom w:w="65" w:type="dxa"/>
+              <w:right w:w="130" w:type="dxa"/>
             </w:tcMar>
             <w:vAlign w:val="center"/>
           </w:tcPr>
@@ -212,10 +212,10 @@
               <w:right w:val="single" w:sz="6" w:color="000000"/>
             </w:tcBorders>
             <w:tcMar>
-              <w:top w:w="45" w:type="dxa"/>
-              <w:start w:w="90" w:type="dxa"/>
-              <w:bottom w:w="45" w:type="dxa"/>
-              <w:end w:w="90" w:type="dxa"/>
+              <w:top w:w="65" w:type="dxa"/>
+              <w:left w:w="130" w:type="dxa"/>
+              <w:bottom w:w="65" w:type="dxa"/>
+              <w:right w:w="130" w:type="dxa"/>
             </w:tcMar>
             <w:vAlign w:val="center"/>
           </w:tcPr>
@@ -253,10 +253,10 @@
               <w:right w:val="single" w:sz="6" w:color="000000"/>
             </w:tcBorders>
             <w:tcMar>
-              <w:top w:w="45" w:type="dxa"/>
-              <w:start w:w="90" w:type="dxa"/>
-              <w:bottom w:w="45" w:type="dxa"/>
-              <w:end w:w="90" w:type="dxa"/>
+              <w:top w:w="65" w:type="dxa"/>
+              <w:left w:w="130" w:type="dxa"/>
+              <w:bottom w:w="65" w:type="dxa"/>
+              <w:right w:w="130" w:type="dxa"/>
             </w:tcMar>
             <w:vAlign w:val="center"/>
           </w:tcPr>
@@ -294,10 +294,10 @@
               <w:right w:val="single" w:sz="6" w:color="000000"/>
             </w:tcBorders>
             <w:tcMar>
-              <w:top w:w="45" w:type="dxa"/>
-              <w:start w:w="90" w:type="dxa"/>
-              <w:bottom w:w="45" w:type="dxa"/>
-              <w:end w:w="90" w:type="dxa"/>
+              <w:top w:w="65" w:type="dxa"/>
+              <w:left w:w="130" w:type="dxa"/>
+              <w:bottom w:w="65" w:type="dxa"/>
+              <w:right w:w="130" w:type="dxa"/>
             </w:tcMar>
             <w:vAlign w:val="center"/>
           </w:tcPr>
@@ -335,10 +335,10 @@
               <w:right w:val="single" w:sz="6" w:color="000000"/>
             </w:tcBorders>
             <w:tcMar>
-              <w:top w:w="45" w:type="dxa"/>
-              <w:start w:w="90" w:type="dxa"/>
-              <w:bottom w:w="45" w:type="dxa"/>
-              <w:end w:w="90" w:type="dxa"/>
+              <w:top w:w="65" w:type="dxa"/>
+              <w:left w:w="130" w:type="dxa"/>
+              <w:bottom w:w="65" w:type="dxa"/>
+              <w:right w:w="130" w:type="dxa"/>
             </w:tcMar>
             <w:vAlign w:val="center"/>
           </w:tcPr>
@@ -412,10 +412,10 @@
               <w:right w:val="single" w:sz="6" w:color="000000"/>
             </w:tcBorders>
             <w:tcMar>
-              <w:top w:w="35" w:type="dxa"/>
-              <w:start w:w="85" w:type="dxa"/>
-              <w:bottom w:w="35" w:type="dxa"/>
-              <w:end w:w="85" w:type="dxa"/>
+              <w:top w:w="65" w:type="dxa"/>
+              <w:left w:w="130" w:type="dxa"/>
+              <w:bottom w:w="65" w:type="dxa"/>
+              <w:right w:w="130" w:type="dxa"/>
             </w:tcMar>
             <w:vAlign w:val="center"/>
             <w:shd w:fill="E8E8E8" w:val="clear"/>
@@ -452,10 +452,10 @@
               <w:right w:val="single" w:sz="6" w:color="000000"/>
             </w:tcBorders>
             <w:tcMar>
-              <w:top w:w="45" w:type="dxa"/>
-              <w:start w:w="90" w:type="dxa"/>
-              <w:bottom w:w="45" w:type="dxa"/>
-              <w:end w:w="90" w:type="dxa"/>
+              <w:top w:w="65" w:type="dxa"/>
+              <w:left w:w="130" w:type="dxa"/>
+              <w:bottom w:w="65" w:type="dxa"/>
+              <w:right w:w="130" w:type="dxa"/>
             </w:tcMar>
             <w:vAlign w:val="center"/>
           </w:tcPr>
@@ -494,10 +494,10 @@
               <w:right w:val="single" w:sz="6" w:color="000000"/>
             </w:tcBorders>
             <w:tcMar>
-              <w:top w:w="45" w:type="dxa"/>
-              <w:start w:w="90" w:type="dxa"/>
-              <w:bottom w:w="45" w:type="dxa"/>
-              <w:end w:w="90" w:type="dxa"/>
+              <w:top w:w="65" w:type="dxa"/>
+              <w:left w:w="130" w:type="dxa"/>
+              <w:bottom w:w="65" w:type="dxa"/>
+              <w:right w:w="130" w:type="dxa"/>
             </w:tcMar>
             <w:vAlign w:val="center"/>
           </w:tcPr>
@@ -541,10 +541,10 @@
               <w:right w:val="single" w:sz="6" w:color="000000"/>
             </w:tcBorders>
             <w:tcMar>
-              <w:top w:w="45" w:type="dxa"/>
-              <w:start w:w="90" w:type="dxa"/>
-              <w:bottom w:w="45" w:type="dxa"/>
-              <w:end w:w="90" w:type="dxa"/>
+              <w:top w:w="65" w:type="dxa"/>
+              <w:left w:w="130" w:type="dxa"/>
+              <w:bottom w:w="65" w:type="dxa"/>
+              <w:right w:w="130" w:type="dxa"/>
             </w:tcMar>
             <w:vAlign w:val="center"/>
           </w:tcPr>
@@ -582,10 +582,10 @@
               <w:right w:val="single" w:sz="6" w:color="000000"/>
             </w:tcBorders>
             <w:tcMar>
-              <w:top w:w="45" w:type="dxa"/>
-              <w:start w:w="90" w:type="dxa"/>
-              <w:bottom w:w="45" w:type="dxa"/>
-              <w:end w:w="90" w:type="dxa"/>
+              <w:top w:w="65" w:type="dxa"/>
+              <w:left w:w="130" w:type="dxa"/>
+              <w:bottom w:w="65" w:type="dxa"/>
+              <w:right w:w="130" w:type="dxa"/>
             </w:tcMar>
             <w:vAlign w:val="center"/>
           </w:tcPr>
@@ -623,10 +623,10 @@
               <w:right w:val="single" w:sz="6" w:color="000000"/>
             </w:tcBorders>
             <w:tcMar>
-              <w:top w:w="45" w:type="dxa"/>
-              <w:start w:w="90" w:type="dxa"/>
-              <w:bottom w:w="45" w:type="dxa"/>
-              <w:end w:w="90" w:type="dxa"/>
+              <w:top w:w="65" w:type="dxa"/>
+              <w:left w:w="130" w:type="dxa"/>
+              <w:bottom w:w="65" w:type="dxa"/>
+              <w:right w:w="130" w:type="dxa"/>
             </w:tcMar>
             <w:vAlign w:val="center"/>
           </w:tcPr>
@@ -670,10 +670,10 @@
               <w:right w:val="single" w:sz="6" w:color="000000"/>
             </w:tcBorders>
             <w:tcMar>
-              <w:top w:w="45" w:type="dxa"/>
-              <w:start w:w="90" w:type="dxa"/>
-              <w:bottom w:w="45" w:type="dxa"/>
-              <w:end w:w="90" w:type="dxa"/>
+              <w:top w:w="65" w:type="dxa"/>
+              <w:left w:w="130" w:type="dxa"/>
+              <w:bottom w:w="65" w:type="dxa"/>
+              <w:right w:w="130" w:type="dxa"/>
             </w:tcMar>
             <w:vAlign w:val="center"/>
           </w:tcPr>
@@ -711,10 +711,10 @@
               <w:right w:val="single" w:sz="6" w:color="000000"/>
             </w:tcBorders>
             <w:tcMar>
-              <w:top w:w="45" w:type="dxa"/>
-              <w:start w:w="90" w:type="dxa"/>
-              <w:bottom w:w="45" w:type="dxa"/>
-              <w:end w:w="90" w:type="dxa"/>
+              <w:top w:w="65" w:type="dxa"/>
+              <w:left w:w="130" w:type="dxa"/>
+              <w:bottom w:w="65" w:type="dxa"/>
+              <w:right w:w="130" w:type="dxa"/>
             </w:tcMar>
             <w:vAlign w:val="center"/>
           </w:tcPr>
@@ -752,10 +752,10 @@
               <w:right w:val="single" w:sz="6" w:color="000000"/>
             </w:tcBorders>
             <w:tcMar>
-              <w:top w:w="45" w:type="dxa"/>
-              <w:start w:w="90" w:type="dxa"/>
-              <w:bottom w:w="45" w:type="dxa"/>
-              <w:end w:w="90" w:type="dxa"/>
+              <w:top w:w="65" w:type="dxa"/>
+              <w:left w:w="130" w:type="dxa"/>
+              <w:bottom w:w="65" w:type="dxa"/>
+              <w:right w:w="130" w:type="dxa"/>
             </w:tcMar>
             <w:vAlign w:val="center"/>
           </w:tcPr>
@@ -798,10 +798,10 @@
               <w:right w:val="single" w:sz="6" w:color="000000"/>
             </w:tcBorders>
             <w:tcMar>
-              <w:top w:w="45" w:type="dxa"/>
-              <w:start w:w="90" w:type="dxa"/>
-              <w:bottom w:w="45" w:type="dxa"/>
-              <w:end w:w="90" w:type="dxa"/>
+              <w:top w:w="65" w:type="dxa"/>
+              <w:left w:w="130" w:type="dxa"/>
+              <w:bottom w:w="65" w:type="dxa"/>
+              <w:right w:w="130" w:type="dxa"/>
             </w:tcMar>
             <w:vAlign w:val="center"/>
           </w:tcPr>
@@ -840,10 +840,10 @@
               <w:right w:val="single" w:sz="6" w:color="000000"/>
             </w:tcBorders>
             <w:tcMar>
-              <w:top w:w="45" w:type="dxa"/>
-              <w:start w:w="90" w:type="dxa"/>
-              <w:bottom w:w="45" w:type="dxa"/>
-              <w:end w:w="90" w:type="dxa"/>
+              <w:top w:w="65" w:type="dxa"/>
+              <w:left w:w="130" w:type="dxa"/>
+              <w:bottom w:w="65" w:type="dxa"/>
+              <w:right w:w="130" w:type="dxa"/>
             </w:tcMar>
             <w:vAlign w:val="center"/>
           </w:tcPr>
@@ -881,10 +881,10 @@
               <w:right w:val="single" w:sz="6" w:color="000000"/>
             </w:tcBorders>
             <w:tcMar>
-              <w:top w:w="45" w:type="dxa"/>
-              <w:start w:w="90" w:type="dxa"/>
-              <w:bottom w:w="45" w:type="dxa"/>
-              <w:end w:w="90" w:type="dxa"/>
+              <w:top w:w="65" w:type="dxa"/>
+              <w:left w:w="130" w:type="dxa"/>
+              <w:bottom w:w="65" w:type="dxa"/>
+              <w:right w:w="130" w:type="dxa"/>
             </w:tcMar>
             <w:vAlign w:val="center"/>
           </w:tcPr>
@@ -928,10 +928,10 @@
               <w:right w:val="single" w:sz="6" w:color="000000"/>
             </w:tcBorders>
             <w:tcMar>
-              <w:top w:w="45" w:type="dxa"/>
-              <w:start w:w="90" w:type="dxa"/>
-              <w:bottom w:w="45" w:type="dxa"/>
-              <w:end w:w="90" w:type="dxa"/>
+              <w:top w:w="65" w:type="dxa"/>
+              <w:left w:w="130" w:type="dxa"/>
+              <w:bottom w:w="65" w:type="dxa"/>
+              <w:right w:w="130" w:type="dxa"/>
             </w:tcMar>
             <w:vAlign w:val="center"/>
           </w:tcPr>
@@ -970,10 +970,10 @@
               <w:right w:val="single" w:sz="6" w:color="000000"/>
             </w:tcBorders>
             <w:tcMar>
-              <w:top w:w="45" w:type="dxa"/>
-              <w:start w:w="90" w:type="dxa"/>
-              <w:bottom w:w="45" w:type="dxa"/>
-              <w:end w:w="90" w:type="dxa"/>
+              <w:top w:w="65" w:type="dxa"/>
+              <w:left w:w="130" w:type="dxa"/>
+              <w:bottom w:w="65" w:type="dxa"/>
+              <w:right w:w="130" w:type="dxa"/>
             </w:tcMar>
             <w:vAlign w:val="center"/>
           </w:tcPr>
@@ -1017,10 +1017,10 @@
               <w:right w:val="single" w:sz="6" w:color="000000"/>
             </w:tcBorders>
             <w:tcMar>
-              <w:top w:w="45" w:type="dxa"/>
-              <w:start w:w="90" w:type="dxa"/>
-              <w:bottom w:w="45" w:type="dxa"/>
-              <w:end w:w="90" w:type="dxa"/>
+              <w:top w:w="65" w:type="dxa"/>
+              <w:left w:w="130" w:type="dxa"/>
+              <w:bottom w:w="65" w:type="dxa"/>
+              <w:right w:w="130" w:type="dxa"/>
             </w:tcMar>
             <w:vAlign w:val="center"/>
           </w:tcPr>
@@ -1059,10 +1059,10 @@
               <w:right w:val="single" w:sz="6" w:color="000000"/>
             </w:tcBorders>
             <w:tcMar>
-              <w:top w:w="45" w:type="dxa"/>
-              <w:start w:w="90" w:type="dxa"/>
-              <w:bottom w:w="45" w:type="dxa"/>
-              <w:end w:w="90" w:type="dxa"/>
+              <w:top w:w="65" w:type="dxa"/>
+              <w:left w:w="130" w:type="dxa"/>
+              <w:bottom w:w="65" w:type="dxa"/>
+              <w:right w:w="130" w:type="dxa"/>
             </w:tcMar>
             <w:vAlign w:val="center"/>
           </w:tcPr>
@@ -1125,10 +1125,10 @@
               <w:right w:val="single" w:sz="6" w:color="000000"/>
             </w:tcBorders>
             <w:tcMar>
-              <w:top w:w="35" w:type="dxa"/>
-              <w:start w:w="85" w:type="dxa"/>
-              <w:bottom w:w="35" w:type="dxa"/>
-              <w:end w:w="85" w:type="dxa"/>
+              <w:top w:w="65" w:type="dxa"/>
+              <w:left w:w="130" w:type="dxa"/>
+              <w:bottom w:w="65" w:type="dxa"/>
+              <w:right w:w="130" w:type="dxa"/>
             </w:tcMar>
             <w:vAlign w:val="center"/>
             <w:shd w:fill="E8E8E8" w:val="clear"/>
@@ -1164,10 +1164,10 @@
               <w:right w:val="single" w:sz="6" w:color="000000"/>
             </w:tcBorders>
             <w:tcMar>
-              <w:top w:w="45" w:type="dxa"/>
-              <w:start w:w="90" w:type="dxa"/>
-              <w:bottom w:w="45" w:type="dxa"/>
-              <w:end w:w="90" w:type="dxa"/>
+              <w:top w:w="65" w:type="dxa"/>
+              <w:left w:w="130" w:type="dxa"/>
+              <w:bottom w:w="65" w:type="dxa"/>
+              <w:right w:w="130" w:type="dxa"/>
             </w:tcMar>
             <w:vAlign w:val="top"/>
           </w:tcPr>
@@ -1205,10 +1205,10 @@
               <w:right w:val="single" w:sz="6" w:color="000000"/>
             </w:tcBorders>
             <w:tcMar>
-              <w:top w:w="45" w:type="dxa"/>
-              <w:start w:w="90" w:type="dxa"/>
-              <w:bottom w:w="45" w:type="dxa"/>
-              <w:end w:w="90" w:type="dxa"/>
+              <w:top w:w="65" w:type="dxa"/>
+              <w:left w:w="130" w:type="dxa"/>
+              <w:bottom w:w="65" w:type="dxa"/>
+              <w:right w:w="130" w:type="dxa"/>
             </w:tcMar>
             <w:vAlign w:val="top"/>
           </w:tcPr>
@@ -1305,10 +1305,10 @@
               <w:right w:val="single" w:sz="6" w:color="000000"/>
             </w:tcBorders>
             <w:tcMar>
-              <w:top w:w="35" w:type="dxa"/>
-              <w:start w:w="85" w:type="dxa"/>
-              <w:bottom w:w="35" w:type="dxa"/>
-              <w:end w:w="85" w:type="dxa"/>
+              <w:top w:w="65" w:type="dxa"/>
+              <w:left w:w="130" w:type="dxa"/>
+              <w:bottom w:w="65" w:type="dxa"/>
+              <w:right w:w="130" w:type="dxa"/>
             </w:tcMar>
             <w:vAlign w:val="center"/>
             <w:shd w:fill="E8E8E8" w:val="clear"/>
@@ -1345,10 +1345,10 @@
               <w:right w:val="single" w:sz="6" w:color="000000"/>
             </w:tcBorders>
             <w:tcMar>
-              <w:top w:w="45" w:type="dxa"/>
-              <w:start w:w="90" w:type="dxa"/>
-              <w:bottom w:w="45" w:type="dxa"/>
-              <w:end w:w="90" w:type="dxa"/>
+              <w:top w:w="65" w:type="dxa"/>
+              <w:left w:w="130" w:type="dxa"/>
+              <w:bottom w:w="65" w:type="dxa"/>
+              <w:right w:w="130" w:type="dxa"/>
             </w:tcMar>
             <w:vAlign w:val="center"/>
             <w:shd w:fill="F4F4F4" w:val="clear"/>
@@ -1379,10 +1379,10 @@
               <w:right w:val="single" w:sz="6" w:color="000000"/>
             </w:tcBorders>
             <w:tcMar>
-              <w:top w:w="45" w:type="dxa"/>
-              <w:start w:w="90" w:type="dxa"/>
-              <w:bottom w:w="45" w:type="dxa"/>
-              <w:end w:w="90" w:type="dxa"/>
+              <w:top w:w="65" w:type="dxa"/>
+              <w:left w:w="130" w:type="dxa"/>
+              <w:bottom w:w="65" w:type="dxa"/>
+              <w:right w:w="130" w:type="dxa"/>
             </w:tcMar>
             <w:vAlign w:val="center"/>
             <w:shd w:fill="F4F4F4" w:val="clear"/>
@@ -1413,10 +1413,10 @@
               <w:right w:val="single" w:sz="6" w:color="000000"/>
             </w:tcBorders>
             <w:tcMar>
-              <w:top w:w="45" w:type="dxa"/>
-              <w:start w:w="90" w:type="dxa"/>
-              <w:bottom w:w="45" w:type="dxa"/>
-              <w:end w:w="90" w:type="dxa"/>
+              <w:top w:w="65" w:type="dxa"/>
+              <w:left w:w="130" w:type="dxa"/>
+              <w:bottom w:w="65" w:type="dxa"/>
+              <w:right w:w="130" w:type="dxa"/>
             </w:tcMar>
             <w:vAlign w:val="center"/>
             <w:shd w:fill="F4F4F4" w:val="clear"/>
@@ -1447,10 +1447,10 @@
               <w:right w:val="single" w:sz="6" w:color="000000"/>
             </w:tcBorders>
             <w:tcMar>
-              <w:top w:w="45" w:type="dxa"/>
-              <w:start w:w="90" w:type="dxa"/>
-              <w:bottom w:w="45" w:type="dxa"/>
-              <w:end w:w="90" w:type="dxa"/>
+              <w:top w:w="65" w:type="dxa"/>
+              <w:left w:w="130" w:type="dxa"/>
+              <w:bottom w:w="65" w:type="dxa"/>
+              <w:right w:w="130" w:type="dxa"/>
             </w:tcMar>
             <w:vAlign w:val="center"/>
             <w:shd w:fill="F4F4F4" w:val="clear"/>
@@ -1481,10 +1481,10 @@
               <w:right w:val="single" w:sz="6" w:color="000000"/>
             </w:tcBorders>
             <w:tcMar>
-              <w:top w:w="45" w:type="dxa"/>
-              <w:start w:w="90" w:type="dxa"/>
-              <w:bottom w:w="45" w:type="dxa"/>
-              <w:end w:w="90" w:type="dxa"/>
+              <w:top w:w="65" w:type="dxa"/>
+              <w:left w:w="130" w:type="dxa"/>
+              <w:bottom w:w="65" w:type="dxa"/>
+              <w:right w:w="130" w:type="dxa"/>
             </w:tcMar>
             <w:vAlign w:val="center"/>
             <w:shd w:fill="F4F4F4" w:val="clear"/>
@@ -1515,10 +1515,10 @@
               <w:right w:val="single" w:sz="6" w:color="000000"/>
             </w:tcBorders>
             <w:tcMar>
-              <w:top w:w="45" w:type="dxa"/>
-              <w:start w:w="90" w:type="dxa"/>
-              <w:bottom w:w="45" w:type="dxa"/>
-              <w:end w:w="90" w:type="dxa"/>
+              <w:top w:w="65" w:type="dxa"/>
+              <w:left w:w="130" w:type="dxa"/>
+              <w:bottom w:w="65" w:type="dxa"/>
+              <w:right w:w="130" w:type="dxa"/>
             </w:tcMar>
             <w:vAlign w:val="center"/>
             <w:shd w:fill="F4F4F4" w:val="clear"/>
@@ -1554,10 +1554,10 @@
               <w:right w:val="single" w:sz="6" w:color="000000"/>
             </w:tcBorders>
             <w:tcMar>
-              <w:top w:w="45" w:type="dxa"/>
-              <w:start w:w="90" w:type="dxa"/>
-              <w:bottom w:w="45" w:type="dxa"/>
-              <w:end w:w="90" w:type="dxa"/>
+              <w:top w:w="65" w:type="dxa"/>
+              <w:left w:w="130" w:type="dxa"/>
+              <w:bottom w:w="65" w:type="dxa"/>
+              <w:right w:w="130" w:type="dxa"/>
             </w:tcMar>
             <w:vAlign w:val="center"/>
           </w:tcPr>
@@ -1586,10 +1586,10 @@
               <w:right w:val="single" w:sz="6" w:color="000000"/>
             </w:tcBorders>
             <w:tcMar>
-              <w:top w:w="45" w:type="dxa"/>
-              <w:start w:w="90" w:type="dxa"/>
-              <w:bottom w:w="45" w:type="dxa"/>
-              <w:end w:w="90" w:type="dxa"/>
+              <w:top w:w="65" w:type="dxa"/>
+              <w:left w:w="130" w:type="dxa"/>
+              <w:bottom w:w="65" w:type="dxa"/>
+              <w:right w:w="130" w:type="dxa"/>
             </w:tcMar>
             <w:vAlign w:val="center"/>
           </w:tcPr>
@@ -1619,10 +1619,10 @@
               <w:right w:val="single" w:sz="6" w:color="000000"/>
             </w:tcBorders>
             <w:tcMar>
-              <w:top w:w="45" w:type="dxa"/>
-              <w:start w:w="90" w:type="dxa"/>
-              <w:bottom w:w="45" w:type="dxa"/>
-              <w:end w:w="90" w:type="dxa"/>
+              <w:top w:w="65" w:type="dxa"/>
+              <w:left w:w="130" w:type="dxa"/>
+              <w:bottom w:w="65" w:type="dxa"/>
+              <w:right w:w="130" w:type="dxa"/>
             </w:tcMar>
             <w:vAlign w:val="center"/>
           </w:tcPr>
@@ -1652,10 +1652,10 @@
               <w:right w:val="single" w:sz="6" w:color="000000"/>
             </w:tcBorders>
             <w:tcMar>
-              <w:top w:w="45" w:type="dxa"/>
-              <w:start w:w="90" w:type="dxa"/>
-              <w:bottom w:w="45" w:type="dxa"/>
-              <w:end w:w="90" w:type="dxa"/>
+              <w:top w:w="65" w:type="dxa"/>
+              <w:left w:w="130" w:type="dxa"/>
+              <w:bottom w:w="65" w:type="dxa"/>
+              <w:right w:w="130" w:type="dxa"/>
             </w:tcMar>
             <w:vAlign w:val="center"/>
           </w:tcPr>
@@ -1685,10 +1685,10 @@
               <w:right w:val="single" w:sz="6" w:color="000000"/>
             </w:tcBorders>
             <w:tcMar>
-              <w:top w:w="45" w:type="dxa"/>
-              <w:start w:w="90" w:type="dxa"/>
-              <w:bottom w:w="45" w:type="dxa"/>
-              <w:end w:w="90" w:type="dxa"/>
+              <w:top w:w="65" w:type="dxa"/>
+              <w:left w:w="130" w:type="dxa"/>
+              <w:bottom w:w="65" w:type="dxa"/>
+              <w:right w:w="130" w:type="dxa"/>
             </w:tcMar>
             <w:vAlign w:val="center"/>
           </w:tcPr>
@@ -1718,10 +1718,10 @@
               <w:right w:val="single" w:sz="6" w:color="000000"/>
             </w:tcBorders>
             <w:tcMar>
-              <w:top w:w="45" w:type="dxa"/>
-              <w:start w:w="90" w:type="dxa"/>
-              <w:bottom w:w="45" w:type="dxa"/>
-              <w:end w:w="90" w:type="dxa"/>
+              <w:top w:w="65" w:type="dxa"/>
+              <w:left w:w="130" w:type="dxa"/>
+              <w:bottom w:w="65" w:type="dxa"/>
+              <w:right w:w="130" w:type="dxa"/>
             </w:tcMar>
             <w:vAlign w:val="center"/>
           </w:tcPr>
@@ -1755,10 +1755,10 @@
               <w:right w:val="single" w:sz="6" w:color="000000"/>
             </w:tcBorders>
             <w:tcMar>
-              <w:top w:w="45" w:type="dxa"/>
-              <w:start w:w="90" w:type="dxa"/>
-              <w:bottom w:w="45" w:type="dxa"/>
-              <w:end w:w="90" w:type="dxa"/>
+              <w:top w:w="65" w:type="dxa"/>
+              <w:left w:w="130" w:type="dxa"/>
+              <w:bottom w:w="65" w:type="dxa"/>
+              <w:right w:w="130" w:type="dxa"/>
             </w:tcMar>
             <w:vAlign w:val="center"/>
           </w:tcPr>
@@ -1787,10 +1787,10 @@
               <w:right w:val="single" w:sz="6" w:color="000000"/>
             </w:tcBorders>
             <w:tcMar>
-              <w:top w:w="45" w:type="dxa"/>
-              <w:start w:w="90" w:type="dxa"/>
-              <w:bottom w:w="45" w:type="dxa"/>
-              <w:end w:w="90" w:type="dxa"/>
+              <w:top w:w="65" w:type="dxa"/>
+              <w:left w:w="130" w:type="dxa"/>
+              <w:bottom w:w="65" w:type="dxa"/>
+              <w:right w:w="130" w:type="dxa"/>
             </w:tcMar>
             <w:vAlign w:val="center"/>
           </w:tcPr>
@@ -1820,10 +1820,10 @@
               <w:right w:val="single" w:sz="6" w:color="000000"/>
             </w:tcBorders>
             <w:tcMar>
-              <w:top w:w="45" w:type="dxa"/>
-              <w:start w:w="90" w:type="dxa"/>
-              <w:bottom w:w="45" w:type="dxa"/>
-              <w:end w:w="90" w:type="dxa"/>
+              <w:top w:w="65" w:type="dxa"/>
+              <w:left w:w="130" w:type="dxa"/>
+              <w:bottom w:w="65" w:type="dxa"/>
+              <w:right w:w="130" w:type="dxa"/>
             </w:tcMar>
             <w:vAlign w:val="center"/>
           </w:tcPr>
@@ -1853,10 +1853,10 @@
               <w:right w:val="single" w:sz="6" w:color="000000"/>
             </w:tcBorders>
             <w:tcMar>
-              <w:top w:w="45" w:type="dxa"/>
-              <w:start w:w="90" w:type="dxa"/>
-              <w:bottom w:w="45" w:type="dxa"/>
-              <w:end w:w="90" w:type="dxa"/>
+              <w:top w:w="65" w:type="dxa"/>
+              <w:left w:w="130" w:type="dxa"/>
+              <w:bottom w:w="65" w:type="dxa"/>
+              <w:right w:w="130" w:type="dxa"/>
             </w:tcMar>
             <w:vAlign w:val="center"/>
           </w:tcPr>
@@ -1886,10 +1886,10 @@
               <w:right w:val="single" w:sz="6" w:color="000000"/>
             </w:tcBorders>
             <w:tcMar>
-              <w:top w:w="45" w:type="dxa"/>
-              <w:start w:w="90" w:type="dxa"/>
-              <w:bottom w:w="45" w:type="dxa"/>
-              <w:end w:w="90" w:type="dxa"/>
+              <w:top w:w="65" w:type="dxa"/>
+              <w:left w:w="130" w:type="dxa"/>
+              <w:bottom w:w="65" w:type="dxa"/>
+              <w:right w:w="130" w:type="dxa"/>
             </w:tcMar>
             <w:vAlign w:val="center"/>
           </w:tcPr>
@@ -1919,10 +1919,10 @@
               <w:right w:val="single" w:sz="6" w:color="000000"/>
             </w:tcBorders>
             <w:tcMar>
-              <w:top w:w="45" w:type="dxa"/>
-              <w:start w:w="90" w:type="dxa"/>
-              <w:bottom w:w="45" w:type="dxa"/>
-              <w:end w:w="90" w:type="dxa"/>
+              <w:top w:w="65" w:type="dxa"/>
+              <w:left w:w="130" w:type="dxa"/>
+              <w:bottom w:w="65" w:type="dxa"/>
+              <w:right w:w="130" w:type="dxa"/>
             </w:tcMar>
             <w:vAlign w:val="center"/>
           </w:tcPr>
@@ -1956,10 +1956,10 @@
               <w:right w:val="single" w:sz="6" w:color="000000"/>
             </w:tcBorders>
             <w:tcMar>
-              <w:top w:w="45" w:type="dxa"/>
-              <w:start w:w="90" w:type="dxa"/>
-              <w:bottom w:w="45" w:type="dxa"/>
-              <w:end w:w="90" w:type="dxa"/>
+              <w:top w:w="65" w:type="dxa"/>
+              <w:left w:w="130" w:type="dxa"/>
+              <w:bottom w:w="65" w:type="dxa"/>
+              <w:right w:w="130" w:type="dxa"/>
             </w:tcMar>
             <w:vAlign w:val="center"/>
           </w:tcPr>
@@ -1988,10 +1988,10 @@
               <w:right w:val="single" w:sz="6" w:color="000000"/>
             </w:tcBorders>
             <w:tcMar>
-              <w:top w:w="45" w:type="dxa"/>
-              <w:start w:w="90" w:type="dxa"/>
-              <w:bottom w:w="45" w:type="dxa"/>
-              <w:end w:w="90" w:type="dxa"/>
+              <w:top w:w="65" w:type="dxa"/>
+              <w:left w:w="130" w:type="dxa"/>
+              <w:bottom w:w="65" w:type="dxa"/>
+              <w:right w:w="130" w:type="dxa"/>
             </w:tcMar>
             <w:vAlign w:val="center"/>
           </w:tcPr>
@@ -2021,10 +2021,10 @@
               <w:right w:val="single" w:sz="6" w:color="000000"/>
             </w:tcBorders>
             <w:tcMar>
-              <w:top w:w="45" w:type="dxa"/>
-              <w:start w:w="90" w:type="dxa"/>
-              <w:bottom w:w="45" w:type="dxa"/>
-              <w:end w:w="90" w:type="dxa"/>
+              <w:top w:w="65" w:type="dxa"/>
+              <w:left w:w="130" w:type="dxa"/>
+              <w:bottom w:w="65" w:type="dxa"/>
+              <w:right w:w="130" w:type="dxa"/>
             </w:tcMar>
             <w:vAlign w:val="center"/>
           </w:tcPr>
@@ -2054,10 +2054,10 @@
               <w:right w:val="single" w:sz="6" w:color="000000"/>
             </w:tcBorders>
             <w:tcMar>
-              <w:top w:w="45" w:type="dxa"/>
-              <w:start w:w="90" w:type="dxa"/>
-              <w:bottom w:w="45" w:type="dxa"/>
-              <w:end w:w="90" w:type="dxa"/>
+              <w:top w:w="65" w:type="dxa"/>
+              <w:left w:w="130" w:type="dxa"/>
+              <w:bottom w:w="65" w:type="dxa"/>
+              <w:right w:w="130" w:type="dxa"/>
             </w:tcMar>
             <w:vAlign w:val="center"/>
           </w:tcPr>
@@ -2087,10 +2087,10 @@
               <w:right w:val="single" w:sz="6" w:color="000000"/>
             </w:tcBorders>
             <w:tcMar>
-              <w:top w:w="45" w:type="dxa"/>
-              <w:start w:w="90" w:type="dxa"/>
-              <w:bottom w:w="45" w:type="dxa"/>
-              <w:end w:w="90" w:type="dxa"/>
+              <w:top w:w="65" w:type="dxa"/>
+              <w:left w:w="130" w:type="dxa"/>
+              <w:bottom w:w="65" w:type="dxa"/>
+              <w:right w:w="130" w:type="dxa"/>
             </w:tcMar>
             <w:vAlign w:val="center"/>
           </w:tcPr>
@@ -2120,10 +2120,10 @@
               <w:right w:val="single" w:sz="6" w:color="000000"/>
             </w:tcBorders>
             <w:tcMar>
-              <w:top w:w="45" w:type="dxa"/>
-              <w:start w:w="90" w:type="dxa"/>
-              <w:bottom w:w="45" w:type="dxa"/>
-              <w:end w:w="90" w:type="dxa"/>
+              <w:top w:w="65" w:type="dxa"/>
+              <w:left w:w="130" w:type="dxa"/>
+              <w:bottom w:w="65" w:type="dxa"/>
+              <w:right w:w="130" w:type="dxa"/>
             </w:tcMar>
             <w:vAlign w:val="center"/>
           </w:tcPr>
@@ -2157,10 +2157,10 @@
               <w:right w:val="single" w:sz="6" w:color="000000"/>
             </w:tcBorders>
             <w:tcMar>
-              <w:top w:w="45" w:type="dxa"/>
-              <w:start w:w="90" w:type="dxa"/>
-              <w:bottom w:w="45" w:type="dxa"/>
-              <w:end w:w="90" w:type="dxa"/>
+              <w:top w:w="65" w:type="dxa"/>
+              <w:left w:w="130" w:type="dxa"/>
+              <w:bottom w:w="65" w:type="dxa"/>
+              <w:right w:w="130" w:type="dxa"/>
             </w:tcMar>
             <w:vAlign w:val="center"/>
           </w:tcPr>
@@ -2189,10 +2189,10 @@
               <w:right w:val="single" w:sz="6" w:color="000000"/>
             </w:tcBorders>
             <w:tcMar>
-              <w:top w:w="45" w:type="dxa"/>
-              <w:start w:w="90" w:type="dxa"/>
-              <w:bottom w:w="45" w:type="dxa"/>
-              <w:end w:w="90" w:type="dxa"/>
+              <w:top w:w="65" w:type="dxa"/>
+              <w:left w:w="130" w:type="dxa"/>
+              <w:bottom w:w="65" w:type="dxa"/>
+              <w:right w:w="130" w:type="dxa"/>
             </w:tcMar>
             <w:vAlign w:val="center"/>
           </w:tcPr>
@@ -2222,10 +2222,10 @@
               <w:right w:val="single" w:sz="6" w:color="000000"/>
             </w:tcBorders>
             <w:tcMar>
-              <w:top w:w="45" w:type="dxa"/>
-              <w:start w:w="90" w:type="dxa"/>
-              <w:bottom w:w="45" w:type="dxa"/>
-              <w:end w:w="90" w:type="dxa"/>
+              <w:top w:w="65" w:type="dxa"/>
+              <w:left w:w="130" w:type="dxa"/>
+              <w:bottom w:w="65" w:type="dxa"/>
+              <w:right w:w="130" w:type="dxa"/>
             </w:tcMar>
             <w:vAlign w:val="center"/>
           </w:tcPr>
@@ -2255,10 +2255,10 @@
               <w:right w:val="single" w:sz="6" w:color="000000"/>
             </w:tcBorders>
             <w:tcMar>
-              <w:top w:w="45" w:type="dxa"/>
-              <w:start w:w="90" w:type="dxa"/>
-              <w:bottom w:w="45" w:type="dxa"/>
-              <w:end w:w="90" w:type="dxa"/>
+              <w:top w:w="65" w:type="dxa"/>
+              <w:left w:w="130" w:type="dxa"/>
+              <w:bottom w:w="65" w:type="dxa"/>
+              <w:right w:w="130" w:type="dxa"/>
             </w:tcMar>
             <w:vAlign w:val="center"/>
           </w:tcPr>
@@ -2288,10 +2288,10 @@
               <w:right w:val="single" w:sz="6" w:color="000000"/>
             </w:tcBorders>
             <w:tcMar>
-              <w:top w:w="45" w:type="dxa"/>
-              <w:start w:w="90" w:type="dxa"/>
-              <w:bottom w:w="45" w:type="dxa"/>
-              <w:end w:w="90" w:type="dxa"/>
+              <w:top w:w="65" w:type="dxa"/>
+              <w:left w:w="130" w:type="dxa"/>
+              <w:bottom w:w="65" w:type="dxa"/>
+              <w:right w:w="130" w:type="dxa"/>
             </w:tcMar>
             <w:vAlign w:val="center"/>
           </w:tcPr>
@@ -2321,10 +2321,10 @@
               <w:right w:val="single" w:sz="6" w:color="000000"/>
             </w:tcBorders>
             <w:tcMar>
-              <w:top w:w="45" w:type="dxa"/>
-              <w:start w:w="90" w:type="dxa"/>
-              <w:bottom w:w="45" w:type="dxa"/>
-              <w:end w:w="90" w:type="dxa"/>
+              <w:top w:w="65" w:type="dxa"/>
+              <w:left w:w="130" w:type="dxa"/>
+              <w:bottom w:w="65" w:type="dxa"/>
+              <w:right w:w="130" w:type="dxa"/>
             </w:tcMar>
             <w:vAlign w:val="center"/>
           </w:tcPr>
@@ -2359,10 +2359,10 @@
               <w:right w:val="single" w:sz="6" w:color="000000"/>
             </w:tcBorders>
             <w:tcMar>
-              <w:top w:w="45" w:type="dxa"/>
-              <w:start w:w="90" w:type="dxa"/>
-              <w:bottom w:w="45" w:type="dxa"/>
-              <w:end w:w="90" w:type="dxa"/>
+              <w:top w:w="65" w:type="dxa"/>
+              <w:left w:w="130" w:type="dxa"/>
+              <w:bottom w:w="65" w:type="dxa"/>
+              <w:right w:w="130" w:type="dxa"/>
             </w:tcMar>
             <w:vAlign w:val="center"/>
           </w:tcPr>
@@ -2392,10 +2392,10 @@
               <w:right w:val="single" w:sz="6" w:color="000000"/>
             </w:tcBorders>
             <w:tcMar>
-              <w:top w:w="45" w:type="dxa"/>
-              <w:start w:w="90" w:type="dxa"/>
-              <w:bottom w:w="45" w:type="dxa"/>
-              <w:end w:w="90" w:type="dxa"/>
+              <w:top w:w="65" w:type="dxa"/>
+              <w:left w:w="130" w:type="dxa"/>
+              <w:bottom w:w="65" w:type="dxa"/>
+              <w:right w:w="130" w:type="dxa"/>
             </w:tcMar>
             <w:vAlign w:val="center"/>
           </w:tcPr>
@@ -2430,10 +2430,10 @@
               <w:right w:val="single" w:sz="6" w:color="000000"/>
             </w:tcBorders>
             <w:tcMar>
-              <w:top w:w="45" w:type="dxa"/>
-              <w:start w:w="90" w:type="dxa"/>
-              <w:bottom w:w="45" w:type="dxa"/>
-              <w:end w:w="90" w:type="dxa"/>
+              <w:top w:w="65" w:type="dxa"/>
+              <w:left w:w="130" w:type="dxa"/>
+              <w:bottom w:w="65" w:type="dxa"/>
+              <w:right w:w="130" w:type="dxa"/>
             </w:tcMar>
             <w:vAlign w:val="center"/>
           </w:tcPr>
@@ -2471,10 +2471,10 @@
               <w:right w:val="single" w:sz="6" w:color="000000"/>
             </w:tcBorders>
             <w:tcMar>
-              <w:top w:w="45" w:type="dxa"/>
-              <w:start w:w="90" w:type="dxa"/>
-              <w:bottom w:w="45" w:type="dxa"/>
-              <w:end w:w="90" w:type="dxa"/>
+              <w:top w:w="65" w:type="dxa"/>
+              <w:left w:w="130" w:type="dxa"/>
+              <w:bottom w:w="65" w:type="dxa"/>
+              <w:right w:w="130" w:type="dxa"/>
             </w:tcMar>
             <w:vAlign w:val="center"/>
           </w:tcPr>
@@ -2599,9 +2599,9 @@
             </w:tcBorders>
             <w:tcMar>
               <w:top w:w="45" w:type="dxa"/>
-              <w:start w:w="20" w:type="dxa"/>
+              <w:left w:w="20" w:type="dxa"/>
               <w:bottom w:w="35" w:type="dxa"/>
-              <w:end w:w="20" w:type="dxa"/>
+              <w:right w:w="20" w:type="dxa"/>
             </w:tcMar>
             <w:vAlign w:val="center"/>
           </w:tcPr>
@@ -2632,9 +2632,9 @@
             </w:tcBorders>
             <w:tcMar>
               <w:top w:w="45" w:type="dxa"/>
-              <w:start w:w="20" w:type="dxa"/>
+              <w:left w:w="20" w:type="dxa"/>
               <w:bottom w:w="35" w:type="dxa"/>
-              <w:end w:w="20" w:type="dxa"/>
+              <w:right w:w="20" w:type="dxa"/>
             </w:tcMar>
             <w:vAlign w:val="center"/>
           </w:tcPr>
@@ -2661,7 +2661,7 @@
         <w:pBdr>
           <w:top w:val="dashed" w:sz="6" w:space="4" w:color="000000"/>
         </w:pBdr>
-        <w:spacing w:before="1500" w:after="80" w:line="240" w:lineRule="auto"/>
+        <w:spacing w:before="800" w:after="80" w:line="240" w:lineRule="auto"/>
         <w:jc w:val="center"/>
       </w:pPr>
       <w:r>
@@ -2709,10 +2709,10 @@
               <w:right w:val="single" w:sz="6" w:color="000000"/>
             </w:tcBorders>
             <w:tcMar>
-              <w:top w:w="45" w:type="dxa"/>
-              <w:start w:w="90" w:type="dxa"/>
-              <w:bottom w:w="45" w:type="dxa"/>
-              <w:end w:w="90" w:type="dxa"/>
+              <w:top w:w="65" w:type="dxa"/>
+              <w:left w:w="130" w:type="dxa"/>
+              <w:bottom w:w="65" w:type="dxa"/>
+              <w:right w:w="130" w:type="dxa"/>
             </w:tcMar>
             <w:vAlign w:val="center"/>
           </w:tcPr>
@@ -2768,10 +2768,10 @@
               <w:right w:val="single" w:sz="6" w:color="000000"/>
             </w:tcBorders>
             <w:tcMar>
-              <w:top w:w="45" w:type="dxa"/>
-              <w:start w:w="90" w:type="dxa"/>
-              <w:bottom w:w="45" w:type="dxa"/>
-              <w:end w:w="90" w:type="dxa"/>
+              <w:top w:w="65" w:type="dxa"/>
+              <w:left w:w="130" w:type="dxa"/>
+              <w:bottom w:w="65" w:type="dxa"/>
+              <w:right w:w="130" w:type="dxa"/>
             </w:tcMar>
             <w:vAlign w:val="center"/>
           </w:tcPr>
@@ -2826,10 +2826,10 @@
             </w:tcBorders>
             <w:shd w:val="clear" w:color="auto" w:fill="E8E8E8"/>
             <w:tcMar>
-              <w:top w:w="45" w:type="dxa"/>
-              <w:start w:w="90" w:type="dxa"/>
-              <w:bottom w:w="45" w:type="dxa"/>
-              <w:end w:w="90" w:type="dxa"/>
+              <w:top w:w="65" w:type="dxa"/>
+              <w:left w:w="130" w:type="dxa"/>
+              <w:bottom w:w="65" w:type="dxa"/>
+              <w:right w:w="130" w:type="dxa"/>
             </w:tcMar>
             <w:vAlign w:val="center"/>
           </w:tcPr>
@@ -2887,10 +2887,10 @@
               <w:right w:val="single" w:sz="6" w:color="000000"/>
             </w:tcBorders>
             <w:tcMar>
-              <w:top w:w="45" w:type="dxa"/>
-              <w:start w:w="90" w:type="dxa"/>
-              <w:bottom w:w="45" w:type="dxa"/>
-              <w:end w:w="90" w:type="dxa"/>
+              <w:top w:w="65" w:type="dxa"/>
+              <w:left w:w="130" w:type="dxa"/>
+              <w:bottom w:w="65" w:type="dxa"/>
+              <w:right w:w="130" w:type="dxa"/>
             </w:tcMar>
             <w:vAlign w:val="center"/>
           </w:tcPr>
@@ -2928,10 +2928,10 @@
               <w:right w:val="single" w:sz="6" w:color="000000"/>
             </w:tcBorders>
             <w:tcMar>
-              <w:top w:w="45" w:type="dxa"/>
-              <w:start w:w="90" w:type="dxa"/>
-              <w:bottom w:w="45" w:type="dxa"/>
-              <w:end w:w="90" w:type="dxa"/>
+              <w:top w:w="65" w:type="dxa"/>
+              <w:left w:w="130" w:type="dxa"/>
+              <w:bottom w:w="65" w:type="dxa"/>
+              <w:right w:w="130" w:type="dxa"/>
             </w:tcMar>
             <w:vAlign w:val="center"/>
           </w:tcPr>
@@ -2969,10 +2969,10 @@
               <w:right w:val="single" w:sz="6" w:color="000000"/>
             </w:tcBorders>
             <w:tcMar>
-              <w:top w:w="45" w:type="dxa"/>
-              <w:start w:w="90" w:type="dxa"/>
-              <w:bottom w:w="45" w:type="dxa"/>
-              <w:end w:w="90" w:type="dxa"/>
+              <w:top w:w="65" w:type="dxa"/>
+              <w:left w:w="130" w:type="dxa"/>
+              <w:bottom w:w="65" w:type="dxa"/>
+              <w:right w:w="130" w:type="dxa"/>
             </w:tcMar>
             <w:vAlign w:val="center"/>
           </w:tcPr>
@@ -3017,10 +3017,10 @@
               <w:right w:val="single" w:sz="6" w:color="000000"/>
             </w:tcBorders>
             <w:tcMar>
-              <w:top w:w="45" w:type="dxa"/>
-              <w:start w:w="90" w:type="dxa"/>
-              <w:bottom w:w="45" w:type="dxa"/>
-              <w:end w:w="90" w:type="dxa"/>
+              <w:top w:w="65" w:type="dxa"/>
+              <w:left w:w="130" w:type="dxa"/>
+              <w:bottom w:w="65" w:type="dxa"/>
+              <w:right w:w="130" w:type="dxa"/>
             </w:tcMar>
             <w:vAlign w:val="center"/>
           </w:tcPr>
@@ -3059,10 +3059,10 @@
               <w:right w:val="single" w:sz="6" w:color="000000"/>
             </w:tcBorders>
             <w:tcMar>
-              <w:top w:w="45" w:type="dxa"/>
-              <w:start w:w="90" w:type="dxa"/>
-              <w:bottom w:w="45" w:type="dxa"/>
-              <w:end w:w="90" w:type="dxa"/>
+              <w:top w:w="65" w:type="dxa"/>
+              <w:left w:w="130" w:type="dxa"/>
+              <w:bottom w:w="65" w:type="dxa"/>
+              <w:right w:w="130" w:type="dxa"/>
             </w:tcMar>
             <w:vAlign w:val="top"/>
           </w:tcPr>

</xml_diff>